<commit_message>
Registro de estructura 2026 y base del sistema HormigueroCORE
</commit_message>
<xml_diff>
--- a/HV/Hoja De Vida/2026 Dr.Ing. Dumar Alejandro Rodriguez Mesa HDV.docx
+++ b/HV/Hoja De Vida/2026 Dr.Ing. Dumar Alejandro Rodriguez Mesa HDV.docx
@@ -119,10 +119,62 @@
           <w:sz w:val="26"/>
           <w:szCs w:val="26"/>
         </w:rPr>
-        <w:t>Analista En Mar</w:t>
-      </w:r>
-      <w:bookmarkStart w:id="0" w:name="_GoBack"/>
-      <w:bookmarkEnd w:id="0"/>
+        <w:t xml:space="preserve">Analista En </w:t>
+      </w:r>
+      <w:proofErr w:type="spellStart"/>
+      <w:r>
+        <w:rPr>
+          <w:rFonts w:ascii="Arial" w:hAnsi="Arial" w:cs="Arial"/>
+          <w:bCs/>
+          <w:color w:val="7F7F7F" w:themeColor="text1" w:themeTint="80"/>
+          <w:sz w:val="26"/>
+          <w:szCs w:val="26"/>
+        </w:rPr>
+        <w:t>Mar</w:t>
+      </w:r>
+      <w:r>
+        <w:rPr>
+          <w:rFonts w:ascii="Arial" w:hAnsi="Arial" w:cs="Arial"/>
+          <w:bCs/>
+          <w:color w:val="7F7F7F" w:themeColor="text1" w:themeTint="80"/>
+          <w:sz w:val="26"/>
+          <w:szCs w:val="26"/>
+        </w:rPr>
+        <w:t>keting,Analis</w:t>
+      </w:r>
+      <w:proofErr w:type="spellEnd"/>
+      <w:r>
+        <w:rPr>
+          <w:rFonts w:ascii="Arial" w:hAnsi="Arial" w:cs="Arial"/>
+          <w:bCs/>
+          <w:color w:val="7F7F7F" w:themeColor="text1" w:themeTint="80"/>
+          <w:sz w:val="26"/>
+          <w:szCs w:val="26"/>
+        </w:rPr>
+        <w:t xml:space="preserve"> de datos </w:t>
+      </w:r>
+      <w:proofErr w:type="spellStart"/>
+      <w:r>
+        <w:rPr>
+          <w:rFonts w:ascii="Arial" w:hAnsi="Arial" w:cs="Arial"/>
+          <w:bCs/>
+          <w:color w:val="7F7F7F" w:themeColor="text1" w:themeTint="80"/>
+          <w:sz w:val="26"/>
+          <w:szCs w:val="26"/>
+        </w:rPr>
+        <w:t>co</w:t>
+      </w:r>
+      <w:proofErr w:type="spellEnd"/>
+      <w:r>
+        <w:rPr>
+          <w:rFonts w:ascii="Arial" w:hAnsi="Arial" w:cs="Arial"/>
+          <w:bCs/>
+          <w:color w:val="7F7F7F" w:themeColor="text1" w:themeTint="80"/>
+          <w:sz w:val="26"/>
+          <w:szCs w:val="26"/>
+        </w:rPr>
+        <w:t xml:space="preserve"> POWER BI. Pandas Python</w:t>
+      </w:r>
     </w:p>
     <w:p>
       <w:pPr>
@@ -4556,31 +4608,10 @@
           <w:rFonts w:ascii="Arial" w:eastAsia="Tahoma" w:hAnsi="Arial" w:cs="Arial"/>
           <w:b/>
         </w:rPr>
-        <w:pict>
-          <v:shapetype id="_x0000_t75" coordsize="21600,21600" o:spt="75" o:preferrelative="t" path="m@4@5l@4@11@9@11@9@5xe" filled="f" stroked="f">
-            <v:stroke joinstyle="miter"/>
-            <v:formulas>
-              <v:f eqn="if lineDrawn pixelLineWidth 0"/>
-              <v:f eqn="sum @0 1 0"/>
-              <v:f eqn="sum 0 0 @1"/>
-              <v:f eqn="prod @2 1 2"/>
-              <v:f eqn="prod @3 21600 pixelWidth"/>
-              <v:f eqn="prod @3 21600 pixelHeight"/>
-              <v:f eqn="sum @0 0 1"/>
-              <v:f eqn="prod @6 1 2"/>
-              <v:f eqn="prod @7 21600 pixelWidth"/>
-              <v:f eqn="sum @8 21600 0"/>
-              <v:f eqn="prod @7 21600 pixelHeight"/>
-              <v:f eqn="sum @10 21600 0"/>
-            </v:formulas>
-            <v:path o:extrusionok="f" gradientshapeok="t" o:connecttype="rect"/>
-            <o:lock v:ext="edit" aspectratio="t"/>
-          </v:shapetype>
-          <v:shape id="_x0000_i1025" type="#_x0000_t75" style="width:94pt;height:94pt">
-            <v:imagedata r:id="rId12" o:title="QR Firma"/>
-          </v:shape>
-        </w:pict>
-      </w:r>
+        <w:t>FIRMA DIGITAL</w:t>
+      </w:r>
+      <w:bookmarkStart w:id="0" w:name="_GoBack"/>
+      <w:bookmarkEnd w:id="0"/>
     </w:p>
     <w:p>
       <w:pPr>

</xml_diff>

<commit_message>
adicionando archivos y documentacion 11/05/2026
</commit_message>
<xml_diff>
--- a/HV/Hoja De Vida/2026 Dr.Ing. Dumar Alejandro Rodriguez Mesa HDV.docx
+++ b/HV/Hoja De Vida/2026 Dr.Ing. Dumar Alejandro Rodriguez Mesa HDV.docx
@@ -1,6 +1,6 @@
 
 <file path=word/document.xml><?xml version="1.0" encoding="utf-8"?>
-<w:document xmlns:wpc="http://schemas.microsoft.com/office/word/2010/wordprocessingCanvas" xmlns:cx="http://schemas.microsoft.com/office/drawing/2014/chartex" xmlns:cx1="http://schemas.microsoft.com/office/drawing/2015/9/8/chartex" xmlns:mc="http://schemas.openxmlformats.org/markup-compatibility/2006" xmlns:o="urn:schemas-microsoft-com:office:office" xmlns:r="http://schemas.openxmlformats.org/officeDocument/2006/relationships" xmlns:m="http://schemas.openxmlformats.org/officeDocument/2006/math" xmlns:v="urn:schemas-microsoft-com:vml" xmlns:wp14="http://schemas.microsoft.com/office/word/2010/wordprocessingDrawing" xmlns:wp="http://schemas.openxmlformats.org/drawingml/2006/wordprocessingDrawing" xmlns:w10="urn:schemas-microsoft-com:office:word" xmlns:w="http://schemas.openxmlformats.org/wordprocessingml/2006/main" xmlns:w14="http://schemas.microsoft.com/office/word/2010/wordml" xmlns:w15="http://schemas.microsoft.com/office/word/2012/wordml" xmlns:w16se="http://schemas.microsoft.com/office/word/2015/wordml/symex" xmlns:wpg="http://schemas.microsoft.com/office/word/2010/wordprocessingGroup" xmlns:wpi="http://schemas.microsoft.com/office/word/2010/wordprocessingInk" xmlns:wne="http://schemas.microsoft.com/office/word/2006/wordml" xmlns:wps="http://schemas.microsoft.com/office/word/2010/wordprocessingShape" mc:Ignorable="w14 w15 w16se wp14">
+<w:document xmlns:wpc="http://schemas.microsoft.com/office/word/2010/wordprocessingCanvas" xmlns:cx="http://schemas.microsoft.com/office/drawing/2014/chartex" xmlns:cx1="http://schemas.microsoft.com/office/drawing/2015/9/8/chartex" xmlns:cx2="http://schemas.microsoft.com/office/drawing/2015/10/21/chartex" xmlns:cx3="http://schemas.microsoft.com/office/drawing/2016/5/9/chartex" xmlns:cx4="http://schemas.microsoft.com/office/drawing/2016/5/10/chartex" xmlns:cx5="http://schemas.microsoft.com/office/drawing/2016/5/11/chartex" xmlns:cx6="http://schemas.microsoft.com/office/drawing/2016/5/12/chartex" xmlns:cx7="http://schemas.microsoft.com/office/drawing/2016/5/13/chartex" xmlns:cx8="http://schemas.microsoft.com/office/drawing/2016/5/14/chartex" xmlns:mc="http://schemas.openxmlformats.org/markup-compatibility/2006" xmlns:aink="http://schemas.microsoft.com/office/drawing/2016/ink" xmlns:am3d="http://schemas.microsoft.com/office/drawing/2017/model3d" xmlns:o="urn:schemas-microsoft-com:office:office" xmlns:oel="http://schemas.microsoft.com/office/2019/extlst" xmlns:r="http://schemas.openxmlformats.org/officeDocument/2006/relationships" xmlns:m="http://schemas.openxmlformats.org/officeDocument/2006/math" xmlns:v="urn:schemas-microsoft-com:vml" xmlns:wp14="http://schemas.microsoft.com/office/word/2010/wordprocessingDrawing" xmlns:wp="http://schemas.openxmlformats.org/drawingml/2006/wordprocessingDrawing" xmlns:w10="urn:schemas-microsoft-com:office:word" xmlns:w="http://schemas.openxmlformats.org/wordprocessingml/2006/main" xmlns:w14="http://schemas.microsoft.com/office/word/2010/wordml" xmlns:w15="http://schemas.microsoft.com/office/word/2012/wordml" xmlns:w16cex="http://schemas.microsoft.com/office/word/2018/wordml/cex" xmlns:w16cid="http://schemas.microsoft.com/office/word/2016/wordml/cid" xmlns:w16="http://schemas.microsoft.com/office/word/2018/wordml" xmlns:w16du="http://schemas.microsoft.com/office/word/2023/wordml/word16du" xmlns:w16sdtdh="http://schemas.microsoft.com/office/word/2020/wordml/sdtdatahash" xmlns:w16sdtfl="http://schemas.microsoft.com/office/word/2024/wordml/sdtformatlock" xmlns:w16se="http://schemas.microsoft.com/office/word/2015/wordml/symex" xmlns:wpg="http://schemas.microsoft.com/office/word/2010/wordprocessingGroup" xmlns:wpi="http://schemas.microsoft.com/office/word/2010/wordprocessingInk" xmlns:wne="http://schemas.microsoft.com/office/word/2006/wordml" xmlns:wps="http://schemas.microsoft.com/office/word/2010/wordprocessingShape" mc:Ignorable="w14 w15 w16se w16cid w16 w16cex w16sdtdh w16sdtfl w16du wp14">
   <w:body>
     <w:p>
       <w:pPr>
@@ -366,7 +366,7 @@
         <mc:AlternateContent>
           <mc:Choice Requires="wpg">
             <w:drawing>
-              <wp:anchor distT="0" distB="0" distL="114300" distR="114300" simplePos="0" relativeHeight="251661312" behindDoc="0" locked="0" layoutInCell="1" allowOverlap="1">
+              <wp:anchor distT="0" distB="0" distL="114300" distR="114300" simplePos="0" relativeHeight="251661312" behindDoc="0" locked="0" layoutInCell="1" allowOverlap="1" wp14:anchorId="05D8F9E5" wp14:editId="6FF780C8">
                 <wp:simplePos x="0" y="0"/>
                 <wp:positionH relativeFrom="margin">
                   <wp:align>center</wp:align>
@@ -669,11 +669,7 @@
                           </pic:cNvPicPr>
                         </pic:nvPicPr>
                         <pic:blipFill>
-                          <a:blip r:embed="rId6">
-                            <a:extLst>
-                              <a:ext uri="{96DAC541-7B7A-43D3-8B79-37D633B846F1}"/>
-                            </a:extLst>
-                          </a:blip>
+                          <a:blip r:embed="rId6"/>
                           <a:stretch>
                             <a:fillRect/>
                           </a:stretch>
@@ -696,11 +692,7 @@
                           </pic:cNvPicPr>
                         </pic:nvPicPr>
                         <pic:blipFill>
-                          <a:blip r:embed="rId7">
-                            <a:extLst>
-                              <a:ext uri="{96DAC541-7B7A-43D3-8B79-37D633B846F1}"/>
-                            </a:extLst>
-                          </a:blip>
+                          <a:blip r:embed="rId7"/>
                           <a:stretch>
                             <a:fillRect/>
                           </a:stretch>
@@ -723,11 +715,7 @@
                           </pic:cNvPicPr>
                         </pic:nvPicPr>
                         <pic:blipFill>
-                          <a:blip r:embed="rId8">
-                            <a:extLst>
-                              <a:ext uri="{96DAC541-7B7A-43D3-8B79-37D633B846F1}"/>
-                            </a:extLst>
-                          </a:blip>
+                          <a:blip r:embed="rId8"/>
                           <a:stretch>
                             <a:fillRect/>
                           </a:stretch>
@@ -756,7 +744,7 @@
           </mc:Choice>
           <mc:Fallback>
             <w:pict>
-              <v:group id="Grupo 61" o:spid="_x0000_s1026" style="position:absolute;left:0;text-align:left;margin-left:0;margin-top:8.6pt;width:217.25pt;height:71.1pt;z-index:251661312;mso-position-horizontal:center;mso-position-horizontal-relative:margin" coordsize="27590,9026" o:gfxdata="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">
+              <v:group w14:anchorId="05D8F9E5" id="Grupo 61" o:spid="_x0000_s1026" style="position:absolute;left:0;text-align:left;margin-left:0;margin-top:8.6pt;width:217.25pt;height:71.1pt;z-index:251661312;mso-position-horizontal:center;mso-position-horizontal-relative:margin" coordsize="27590,9026" o:gfxdata="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">
                 <v:rect id="Rectángulo 62" o:spid="_x0000_s1027" style="position:absolute;width:27590;height:9026;visibility:visible;mso-wrap-style:square;v-text-anchor:middle" o:gfxdata="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" fillcolor="#5a5a5a [2109]" stroked="f" strokeweight="1pt"/>
                 <v:shapetype id="_x0000_t202" coordsize="21600,21600" o:spt="202" path="m,l,21600r21600,l21600,xe">
                   <v:stroke joinstyle="miter"/>
@@ -895,17 +883,14 @@
                   <v:path o:extrusionok="f" gradientshapeok="t" o:connecttype="rect"/>
                   <o:lock v:ext="edit" aspectratio="t"/>
                 </v:shapetype>
-                <v:shape id="Gráfico 66" o:spid="_x0000_s1031" type="#_x0000_t75" alt="Marcador" style="position:absolute;left:5080;top:6223;width:1714;height:1714;visibility:visible;mso-wrap-style:square" o:gfxdata="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">
+                <v:shape id="Gráfico 66" o:spid="_x0000_s1031" type="#_x0000_t75" alt="Marcador" style="position:absolute;left:5080;top:6223;width:1714;height:1714;visibility:visible;mso-wrap-style:square" o:gfxdata="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">
                   <v:imagedata r:id="rId9" o:title="Marcador"/>
-                  <v:path arrowok="t"/>
                 </v:shape>
-                <v:shape id="Gráfico 67" o:spid="_x0000_s1032" type="#_x0000_t75" alt="Auricular" style="position:absolute;left:5080;top:3333;width:1631;height:1632;visibility:visible;mso-wrap-style:square" o:gfxdata="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">
+                <v:shape id="Gráfico 67" o:spid="_x0000_s1032" type="#_x0000_t75" alt="Auricular" style="position:absolute;left:5080;top:3333;width:1631;height:1632;visibility:visible;mso-wrap-style:square" o:gfxdata="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">
                   <v:imagedata r:id="rId10" o:title="Auricular"/>
-                  <v:path arrowok="t"/>
                 </v:shape>
-                <v:shape id="Gráfico 68" o:spid="_x0000_s1033" type="#_x0000_t75" alt="Sobre" style="position:absolute;left:5111;top:635;width:1645;height:1644;visibility:visible;mso-wrap-style:square" o:gfxdata="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">
+                <v:shape id="Gráfico 68" o:spid="_x0000_s1033" type="#_x0000_t75" alt="Sobre" style="position:absolute;left:5111;top:635;width:1645;height:1644;visibility:visible;mso-wrap-style:square" o:gfxdata="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">
                   <v:imagedata r:id="rId11" o:title="Sobre"/>
-                  <v:path arrowok="t"/>
                 </v:shape>
                 <w10:wrap anchorx="margin"/>
               </v:group>
@@ -1135,7 +1120,7 @@
       </w:pPr>
       <w:r>
         <w:rPr>
-          <w:rStyle w:val="Textoennegrita"/>
+          <w:rStyle w:val="Fuerte"/>
           <w:rFonts w:ascii="Arial" w:hAnsi="Arial" w:cs="Arial"/>
         </w:rPr>
         <w:t>Perfil:</w:t>
@@ -1296,6 +1281,7 @@
         </w:numPr>
         <w:rPr>
           <w:rFonts w:ascii="Arial" w:hAnsi="Arial" w:cs="Arial"/>
+          <w:lang w:val="en-US"/>
         </w:rPr>
       </w:pPr>
       <w:r>
@@ -1303,46 +1289,16 @@
           <w:rFonts w:ascii="Arial" w:hAnsi="Arial" w:cs="Arial"/>
           <w:b/>
           <w:bCs/>
-        </w:rPr>
-        <w:t>Back-</w:t>
-      </w:r>
-      <w:proofErr w:type="spellStart"/>
-      <w:r>
-        <w:rPr>
-          <w:rFonts w:ascii="Arial" w:hAnsi="Arial" w:cs="Arial"/>
-          <w:b/>
-          <w:bCs/>
-        </w:rPr>
-        <w:t>End</w:t>
-      </w:r>
-      <w:proofErr w:type="spellEnd"/>
-      <w:r>
-        <w:rPr>
-          <w:rFonts w:ascii="Arial" w:hAnsi="Arial" w:cs="Arial"/>
-          <w:b/>
-          <w:bCs/>
-        </w:rPr>
-        <w:t>:</w:t>
-      </w:r>
-      <w:r>
-        <w:rPr>
-          <w:rFonts w:ascii="Arial" w:hAnsi="Arial" w:cs="Arial"/>
-        </w:rPr>
-        <w:t xml:space="preserve"> Java, .NET, C#, .NET Core, Python, PHP, </w:t>
-      </w:r>
-      <w:proofErr w:type="spellStart"/>
-      <w:r>
-        <w:rPr>
-          <w:rFonts w:ascii="Arial" w:hAnsi="Arial" w:cs="Arial"/>
-        </w:rPr>
-        <w:t>Laravel</w:t>
-      </w:r>
-      <w:proofErr w:type="spellEnd"/>
-      <w:r>
-        <w:rPr>
-          <w:rFonts w:ascii="Arial" w:hAnsi="Arial" w:cs="Arial"/>
-        </w:rPr>
-        <w:t>.</w:t>
+          <w:lang w:val="en-US"/>
+        </w:rPr>
+        <w:t>Back-End:</w:t>
+      </w:r>
+      <w:r>
+        <w:rPr>
+          <w:rFonts w:ascii="Arial" w:hAnsi="Arial" w:cs="Arial"/>
+          <w:lang w:val="en-US"/>
+        </w:rPr>
+        <w:t xml:space="preserve"> Java, .NET, C#, .NET Core, Python, PHP, Laravel.</w:t>
       </w:r>
     </w:p>
     <w:p>
@@ -1354,6 +1310,7 @@
         </w:numPr>
         <w:rPr>
           <w:rFonts w:ascii="Arial" w:hAnsi="Arial" w:cs="Arial"/>
+          <w:lang w:val="en-US"/>
         </w:rPr>
       </w:pPr>
       <w:r>
@@ -1361,30 +1318,14 @@
           <w:rFonts w:ascii="Arial" w:hAnsi="Arial" w:cs="Arial"/>
           <w:b/>
           <w:bCs/>
-        </w:rPr>
-        <w:t>Front-</w:t>
-      </w:r>
-      <w:proofErr w:type="spellStart"/>
-      <w:r>
-        <w:rPr>
-          <w:rFonts w:ascii="Arial" w:hAnsi="Arial" w:cs="Arial"/>
-          <w:b/>
-          <w:bCs/>
-        </w:rPr>
-        <w:t>End</w:t>
-      </w:r>
-      <w:proofErr w:type="spellEnd"/>
-      <w:r>
-        <w:rPr>
-          <w:rFonts w:ascii="Arial" w:hAnsi="Arial" w:cs="Arial"/>
-          <w:b/>
-          <w:bCs/>
-        </w:rPr>
-        <w:t>:</w:t>
-      </w:r>
-      <w:r>
-        <w:rPr>
-          <w:rFonts w:ascii="Arial" w:hAnsi="Arial" w:cs="Arial"/>
+          <w:lang w:val="en-US"/>
+        </w:rPr>
+        <w:t>Front-End:</w:t>
+      </w:r>
+      <w:r>
+        <w:rPr>
+          <w:rFonts w:ascii="Arial" w:hAnsi="Arial" w:cs="Arial"/>
+          <w:lang w:val="en-US"/>
         </w:rPr>
         <w:t xml:space="preserve"> HTML5, CSS3, JavaScript (Angular, React.js, Vue.js).</w:t>
       </w:r>
@@ -1418,6 +1359,7 @@
         </w:numPr>
         <w:rPr>
           <w:rFonts w:ascii="Arial" w:hAnsi="Arial" w:cs="Arial"/>
+          <w:lang w:val="en-US"/>
         </w:rPr>
       </w:pPr>
       <w:r>
@@ -1425,42 +1367,16 @@
           <w:rFonts w:ascii="Arial" w:hAnsi="Arial" w:cs="Arial"/>
           <w:b/>
           <w:bCs/>
+          <w:lang w:val="en-US"/>
         </w:rPr>
         <w:t>SQL:</w:t>
       </w:r>
       <w:r>
         <w:rPr>
           <w:rFonts w:ascii="Arial" w:hAnsi="Arial" w:cs="Arial"/>
-        </w:rPr>
-        <w:t xml:space="preserve"> SQL Server, </w:t>
-      </w:r>
-      <w:proofErr w:type="spellStart"/>
-      <w:r>
-        <w:rPr>
-          <w:rFonts w:ascii="Arial" w:hAnsi="Arial" w:cs="Arial"/>
-        </w:rPr>
-        <w:t>MySQL</w:t>
-      </w:r>
-      <w:proofErr w:type="spellEnd"/>
-      <w:r>
-        <w:rPr>
-          <w:rFonts w:ascii="Arial" w:hAnsi="Arial" w:cs="Arial"/>
-        </w:rPr>
-        <w:t xml:space="preserve">, </w:t>
-      </w:r>
-      <w:proofErr w:type="spellStart"/>
-      <w:r>
-        <w:rPr>
-          <w:rFonts w:ascii="Arial" w:hAnsi="Arial" w:cs="Arial"/>
-        </w:rPr>
-        <w:t>PostgreSQL</w:t>
-      </w:r>
-      <w:proofErr w:type="spellEnd"/>
-      <w:r>
-        <w:rPr>
-          <w:rFonts w:ascii="Arial" w:hAnsi="Arial" w:cs="Arial"/>
-        </w:rPr>
-        <w:t>.</w:t>
+          <w:lang w:val="en-US"/>
+        </w:rPr>
+        <w:t xml:space="preserve"> SQL Server, MySQL, PostgreSQL.</w:t>
       </w:r>
     </w:p>
     <w:p>
@@ -1474,57 +1390,19 @@
           <w:rFonts w:ascii="Arial" w:hAnsi="Arial" w:cs="Arial"/>
         </w:rPr>
       </w:pPr>
-      <w:proofErr w:type="spellStart"/>
       <w:r>
         <w:rPr>
           <w:rFonts w:ascii="Arial" w:hAnsi="Arial" w:cs="Arial"/>
           <w:b/>
           <w:bCs/>
         </w:rPr>
-        <w:t>NoSQL</w:t>
-      </w:r>
-      <w:proofErr w:type="spellEnd"/>
-      <w:r>
-        <w:rPr>
-          <w:rFonts w:ascii="Arial" w:hAnsi="Arial" w:cs="Arial"/>
-          <w:b/>
-          <w:bCs/>
-        </w:rPr>
-        <w:t>:</w:t>
-      </w:r>
-      <w:r>
-        <w:rPr>
-          <w:rFonts w:ascii="Arial" w:hAnsi="Arial" w:cs="Arial"/>
-        </w:rPr>
-        <w:t xml:space="preserve"> </w:t>
-      </w:r>
-      <w:proofErr w:type="spellStart"/>
-      <w:r>
-        <w:rPr>
-          <w:rFonts w:ascii="Arial" w:hAnsi="Arial" w:cs="Arial"/>
-        </w:rPr>
-        <w:t>MongoDB</w:t>
-      </w:r>
-      <w:proofErr w:type="spellEnd"/>
-      <w:r>
-        <w:rPr>
-          <w:rFonts w:ascii="Arial" w:hAnsi="Arial" w:cs="Arial"/>
-        </w:rPr>
-        <w:t xml:space="preserve">, Microsoft </w:t>
-      </w:r>
-      <w:proofErr w:type="spellStart"/>
-      <w:r>
-        <w:rPr>
-          <w:rFonts w:ascii="Arial" w:hAnsi="Arial" w:cs="Arial"/>
-        </w:rPr>
-        <w:t>Azure</w:t>
-      </w:r>
-      <w:proofErr w:type="spellEnd"/>
-      <w:r>
-        <w:rPr>
-          <w:rFonts w:ascii="Arial" w:hAnsi="Arial" w:cs="Arial"/>
-        </w:rPr>
-        <w:t>.</w:t>
+        <w:t>NoSQL:</w:t>
+      </w:r>
+      <w:r>
+        <w:rPr>
+          <w:rFonts w:ascii="Arial" w:hAnsi="Arial" w:cs="Arial"/>
+        </w:rPr>
+        <w:t xml:space="preserve"> MongoDB, Microsoft Azure.</w:t>
       </w:r>
     </w:p>
     <w:p>
@@ -1722,35 +1600,7 @@
         <w:rPr>
           <w:rFonts w:ascii="Arial" w:hAnsi="Arial" w:cs="Arial"/>
         </w:rPr>
-        <w:t xml:space="preserve">, Ubuntu, </w:t>
-      </w:r>
-      <w:proofErr w:type="spellStart"/>
-      <w:r>
-        <w:rPr>
-          <w:rFonts w:ascii="Arial" w:hAnsi="Arial" w:cs="Arial"/>
-        </w:rPr>
-        <w:t>Kali</w:t>
-      </w:r>
-      <w:proofErr w:type="spellEnd"/>
-      <w:r>
-        <w:rPr>
-          <w:rFonts w:ascii="Arial" w:hAnsi="Arial" w:cs="Arial"/>
-        </w:rPr>
-        <w:t xml:space="preserve">, </w:t>
-      </w:r>
-      <w:proofErr w:type="spellStart"/>
-      <w:r>
-        <w:rPr>
-          <w:rFonts w:ascii="Arial" w:hAnsi="Arial" w:cs="Arial"/>
-        </w:rPr>
-        <w:t>Parrot</w:t>
-      </w:r>
-      <w:proofErr w:type="spellEnd"/>
-      <w:r>
-        <w:rPr>
-          <w:rFonts w:ascii="Arial" w:hAnsi="Arial" w:cs="Arial"/>
-        </w:rPr>
-        <w:t xml:space="preserve"> Security).</w:t>
+        <w:t>, Ubuntu, Kali, Parrot Security).</w:t>
       </w:r>
     </w:p>
     <w:p>
@@ -2069,13 +1919,13 @@
       <w:pPr>
         <w:pStyle w:val="NormalWeb"/>
         <w:rPr>
-          <w:rStyle w:val="Textoennegrita"/>
-          <w:rFonts w:ascii="Arial" w:hAnsi="Arial" w:cs="Arial"/>
-        </w:rPr>
-      </w:pPr>
-      <w:r>
-        <w:rPr>
-          <w:rStyle w:val="Textoennegrita"/>
+          <w:rStyle w:val="Fuerte"/>
+          <w:rFonts w:ascii="Arial" w:hAnsi="Arial" w:cs="Arial"/>
+        </w:rPr>
+      </w:pPr>
+      <w:r>
+        <w:rPr>
+          <w:rStyle w:val="Fuerte"/>
           <w:rFonts w:ascii="Arial" w:hAnsi="Arial" w:cs="Arial"/>
         </w:rPr>
         <w:t>Formación Académica:</w:t>
@@ -2102,7 +1952,7 @@
       </w:pPr>
       <w:r>
         <w:rPr>
-          <w:rStyle w:val="Textoennegrita"/>
+          <w:rStyle w:val="Fuerte"/>
           <w:rFonts w:ascii="Arial" w:hAnsi="Arial" w:cs="Arial"/>
         </w:rPr>
         <w:t>Universidad del Tolima</w:t>
@@ -2139,13 +1989,13 @@
       <w:pPr>
         <w:pStyle w:val="NormalWeb"/>
         <w:rPr>
-          <w:rStyle w:val="Textoennegrita"/>
-          <w:rFonts w:ascii="Arial" w:hAnsi="Arial" w:cs="Arial"/>
-        </w:rPr>
-      </w:pPr>
-      <w:r>
-        <w:rPr>
-          <w:rStyle w:val="Textoennegrita"/>
+          <w:rStyle w:val="Fuerte"/>
+          <w:rFonts w:ascii="Arial" w:hAnsi="Arial" w:cs="Arial"/>
+        </w:rPr>
+      </w:pPr>
+      <w:r>
+        <w:rPr>
+          <w:rStyle w:val="Fuerte"/>
           <w:rFonts w:ascii="Arial" w:hAnsi="Arial" w:cs="Arial"/>
         </w:rPr>
         <w:t>Cursos y Certificaciones:</w:t>
@@ -2168,7 +2018,7 @@
       </w:pPr>
       <w:r>
         <w:rPr>
-          <w:rStyle w:val="Textoennegrita"/>
+          <w:rStyle w:val="Fuerte"/>
           <w:rFonts w:ascii="Arial" w:hAnsi="Arial" w:cs="Arial"/>
         </w:rPr>
         <w:lastRenderedPageBreak/>
@@ -2267,16 +2117,8 @@
         <w:rPr>
           <w:rFonts w:ascii="Arial" w:hAnsi="Arial" w:cs="Arial"/>
         </w:rPr>
-        <w:t xml:space="preserve">Construcción de Bases de Datos </w:t>
-      </w:r>
-      <w:proofErr w:type="spellStart"/>
-      <w:r>
-        <w:rPr>
-          <w:rFonts w:ascii="Arial" w:hAnsi="Arial" w:cs="Arial"/>
-        </w:rPr>
-        <w:t>MySQL</w:t>
-      </w:r>
-      <w:proofErr w:type="spellEnd"/>
+        <w:t>Construcción de Bases de Datos MySQL</w:t>
+      </w:r>
     </w:p>
     <w:p>
       <w:pPr>
@@ -2530,13 +2372,13 @@
         <w:pStyle w:val="NormalWeb"/>
         <w:spacing w:line="400" w:lineRule="exact"/>
         <w:rPr>
-          <w:rStyle w:val="Textoennegrita"/>
-          <w:rFonts w:ascii="Arial" w:hAnsi="Arial" w:cs="Arial"/>
-        </w:rPr>
-      </w:pPr>
-      <w:r>
-        <w:rPr>
-          <w:rStyle w:val="Textoennegrita"/>
+          <w:rStyle w:val="Fuerte"/>
+          <w:rFonts w:ascii="Arial" w:hAnsi="Arial" w:cs="Arial"/>
+        </w:rPr>
+      </w:pPr>
+      <w:r>
+        <w:rPr>
+          <w:rStyle w:val="Fuerte"/>
           <w:rFonts w:ascii="Arial" w:hAnsi="Arial" w:cs="Arial"/>
         </w:rPr>
         <w:t>Experiencia Laboral:</w:t>
@@ -2547,25 +2389,23 @@
         <w:pStyle w:val="NormalWeb"/>
         <w:spacing w:line="400" w:lineRule="exact"/>
         <w:rPr>
-          <w:rStyle w:val="Textoennegrita"/>
-          <w:rFonts w:ascii="Arial" w:hAnsi="Arial" w:cs="Arial"/>
-        </w:rPr>
-      </w:pPr>
-      <w:proofErr w:type="spellStart"/>
-      <w:r>
-        <w:rPr>
-          <w:rStyle w:val="Textoennegrita"/>
-          <w:rFonts w:ascii="Arial" w:hAnsi="Arial" w:cs="Arial"/>
-        </w:rPr>
-        <w:t>Aux</w:t>
-      </w:r>
-      <w:proofErr w:type="spellEnd"/>
-      <w:r>
-        <w:rPr>
-          <w:rStyle w:val="Textoennegrita"/>
-          <w:rFonts w:ascii="Arial" w:hAnsi="Arial" w:cs="Arial"/>
-        </w:rPr>
-        <w:t xml:space="preserve"> De Sistemas  – Cooperativa Judicial Del Tolima </w:t>
+          <w:rStyle w:val="Fuerte"/>
+          <w:rFonts w:ascii="Arial" w:hAnsi="Arial" w:cs="Arial"/>
+        </w:rPr>
+      </w:pPr>
+      <w:r>
+        <w:rPr>
+          <w:rStyle w:val="Fuerte"/>
+          <w:rFonts w:ascii="Arial" w:hAnsi="Arial" w:cs="Arial"/>
+        </w:rPr>
+        <w:t xml:space="preserve">Aux De Sistemas  – Cooperativa Judicial Del Tolima </w:t>
+      </w:r>
+      <w:r>
+        <w:rPr>
+          <w:rStyle w:val="Fuerte"/>
+          <w:rFonts w:ascii="Arial" w:hAnsi="Arial" w:cs="Arial"/>
+        </w:rPr>
+        <w:t>Abril 2025 – Actualidad</w:t>
       </w:r>
     </w:p>
     <w:p>
@@ -2573,7 +2413,7 @@
         <w:pStyle w:val="NormalWeb"/>
         <w:spacing w:line="400" w:lineRule="exact"/>
         <w:rPr>
-          <w:rStyle w:val="Textoennegrita"/>
+          <w:rStyle w:val="Fuerte"/>
           <w:rFonts w:ascii="Arial" w:hAnsi="Arial" w:cs="Arial"/>
         </w:rPr>
       </w:pPr>
@@ -2583,13 +2423,23 @@
         <w:pStyle w:val="NormalWeb"/>
         <w:spacing w:line="400" w:lineRule="exact"/>
         <w:rPr>
-          <w:rStyle w:val="Textoennegrita"/>
-          <w:rFonts w:ascii="Arial" w:hAnsi="Arial" w:cs="Arial"/>
-        </w:rPr>
-      </w:pPr>
-      <w:r>
-        <w:rPr>
-          <w:rStyle w:val="Textoennegrita"/>
+          <w:rStyle w:val="Fuerte"/>
+          <w:rFonts w:ascii="Arial" w:hAnsi="Arial" w:cs="Arial"/>
+        </w:rPr>
+      </w:pPr>
+    </w:p>
+    <w:p>
+      <w:pPr>
+        <w:pStyle w:val="NormalWeb"/>
+        <w:spacing w:line="400" w:lineRule="exact"/>
+        <w:rPr>
+          <w:rStyle w:val="Fuerte"/>
+          <w:rFonts w:ascii="Arial" w:hAnsi="Arial" w:cs="Arial"/>
+        </w:rPr>
+      </w:pPr>
+      <w:r>
+        <w:rPr>
+          <w:rStyle w:val="Fuerte"/>
           <w:rFonts w:ascii="Arial" w:hAnsi="Arial" w:cs="Arial"/>
         </w:rPr>
         <w:tab/>
@@ -2597,7 +2447,7 @@
       <w:proofErr w:type="spellStart"/>
       <w:r>
         <w:rPr>
-          <w:rStyle w:val="Textoennegrita"/>
+          <w:rStyle w:val="Fuerte"/>
           <w:rFonts w:ascii="Arial" w:hAnsi="Arial" w:cs="Arial"/>
         </w:rPr>
         <w:t>Tecnologias</w:t>
@@ -2605,7 +2455,7 @@
       <w:proofErr w:type="spellEnd"/>
       <w:r>
         <w:rPr>
-          <w:rStyle w:val="Textoennegrita"/>
+          <w:rStyle w:val="Fuerte"/>
           <w:rFonts w:ascii="Arial" w:hAnsi="Arial" w:cs="Arial"/>
         </w:rPr>
         <w:t xml:space="preserve"> Utilizadas: Lenguajes  De </w:t>
@@ -2613,7 +2463,7 @@
       <w:proofErr w:type="spellStart"/>
       <w:r>
         <w:rPr>
-          <w:rStyle w:val="Textoennegrita"/>
+          <w:rStyle w:val="Fuerte"/>
           <w:rFonts w:ascii="Arial" w:hAnsi="Arial" w:cs="Arial"/>
         </w:rPr>
         <w:t>Programacion</w:t>
@@ -2621,7 +2471,7 @@
       <w:proofErr w:type="spellEnd"/>
       <w:r>
         <w:rPr>
-          <w:rStyle w:val="Textoennegrita"/>
+          <w:rStyle w:val="Fuerte"/>
           <w:rFonts w:ascii="Arial" w:hAnsi="Arial" w:cs="Arial"/>
         </w:rPr>
         <w:t>, Delphi</w:t>
@@ -2632,45 +2482,30 @@
         <w:pStyle w:val="NormalWeb"/>
         <w:spacing w:line="240" w:lineRule="atLeast"/>
         <w:rPr>
-          <w:rStyle w:val="Textoennegrita"/>
-          <w:rFonts w:ascii="Arial" w:hAnsi="Arial" w:cs="Arial"/>
-        </w:rPr>
-      </w:pPr>
-      <w:r>
-        <w:rPr>
-          <w:rStyle w:val="Textoennegrita"/>
-          <w:rFonts w:ascii="Arial" w:hAnsi="Arial" w:cs="Arial"/>
-        </w:rPr>
-        <w:t xml:space="preserve">Ingeniero de Sistemas - Digital </w:t>
+          <w:rStyle w:val="Fuerte"/>
+          <w:rFonts w:ascii="Arial" w:hAnsi="Arial" w:cs="Arial"/>
+        </w:rPr>
+      </w:pPr>
+      <w:r>
+        <w:rPr>
+          <w:rStyle w:val="Fuerte"/>
+          <w:rFonts w:ascii="Arial" w:hAnsi="Arial" w:cs="Arial"/>
+        </w:rPr>
+        <w:lastRenderedPageBreak/>
+        <w:t xml:space="preserve">Ingeniero de Sistemas - Digital Space </w:t>
       </w:r>
       <w:proofErr w:type="spellStart"/>
       <w:r>
         <w:rPr>
-          <w:rStyle w:val="Textoennegrita"/>
-          <w:rFonts w:ascii="Arial" w:hAnsi="Arial" w:cs="Arial"/>
-        </w:rPr>
-        <w:t>Space</w:t>
+          <w:rStyle w:val="Fuerte"/>
+          <w:rFonts w:ascii="Arial" w:hAnsi="Arial" w:cs="Arial"/>
+        </w:rPr>
+        <w:t>Developers</w:t>
       </w:r>
       <w:proofErr w:type="spellEnd"/>
       <w:r>
         <w:rPr>
-          <w:rStyle w:val="Textoennegrita"/>
-          <w:rFonts w:ascii="Arial" w:hAnsi="Arial" w:cs="Arial"/>
-        </w:rPr>
-        <w:t xml:space="preserve"> </w:t>
-      </w:r>
-      <w:proofErr w:type="spellStart"/>
-      <w:r>
-        <w:rPr>
-          <w:rStyle w:val="Textoennegrita"/>
-          <w:rFonts w:ascii="Arial" w:hAnsi="Arial" w:cs="Arial"/>
-        </w:rPr>
-        <w:t>Developers</w:t>
-      </w:r>
-      <w:proofErr w:type="spellEnd"/>
-      <w:r>
-        <w:rPr>
-          <w:rStyle w:val="Textoennegrita"/>
+          <w:rStyle w:val="Fuerte"/>
           <w:rFonts w:ascii="Arial" w:hAnsi="Arial" w:cs="Arial"/>
         </w:rPr>
         <w:t xml:space="preserve"> Enero 2024 – Actualidad (4 meses) Funciones:</w:t>
@@ -2692,7 +2527,6 @@
         <w:rPr>
           <w:rFonts w:ascii="Arial" w:hAnsi="Arial" w:cs="Arial"/>
         </w:rPr>
-        <w:lastRenderedPageBreak/>
         <w:t xml:space="preserve">Desarrollo de </w:t>
       </w:r>
       <w:proofErr w:type="spellStart"/>
@@ -2740,35 +2574,7 @@
         <w:rPr>
           <w:rFonts w:ascii="Arial" w:hAnsi="Arial" w:cs="Arial"/>
         </w:rPr>
-        <w:t xml:space="preserve">Capacitación en </w:t>
-      </w:r>
-      <w:proofErr w:type="spellStart"/>
-      <w:r>
-        <w:rPr>
-          <w:rFonts w:ascii="Arial" w:hAnsi="Arial" w:cs="Arial"/>
-        </w:rPr>
-        <w:t>microservicios</w:t>
-      </w:r>
-      <w:proofErr w:type="spellEnd"/>
-      <w:r>
-        <w:rPr>
-          <w:rFonts w:ascii="Arial" w:hAnsi="Arial" w:cs="Arial"/>
-        </w:rPr>
-        <w:t xml:space="preserve"> con Spring </w:t>
-      </w:r>
-      <w:proofErr w:type="spellStart"/>
-      <w:r>
-        <w:rPr>
-          <w:rFonts w:ascii="Arial" w:hAnsi="Arial" w:cs="Arial"/>
-        </w:rPr>
-        <w:t>Boot</w:t>
-      </w:r>
-      <w:proofErr w:type="spellEnd"/>
-      <w:r>
-        <w:rPr>
-          <w:rFonts w:ascii="Arial" w:hAnsi="Arial" w:cs="Arial"/>
-        </w:rPr>
-        <w:t xml:space="preserve"> para ingenieros de Bancolombia.</w:t>
+        <w:t>Capacitación en microservicios con Spring Boot para ingenieros de Bancolombia.</w:t>
       </w:r>
     </w:p>
     <w:p>
@@ -2801,7 +2607,7 @@
       </w:pPr>
       <w:r>
         <w:rPr>
-          <w:rStyle w:val="Textoennegrita"/>
+          <w:rStyle w:val="Fuerte"/>
           <w:rFonts w:ascii="Arial" w:hAnsi="Arial" w:cs="Arial"/>
         </w:rPr>
         <w:t>Tecnologías Utilizadas</w:t>
@@ -2830,14 +2636,14 @@
         <w:rPr>
           <w:rFonts w:ascii="Arial" w:hAnsi="Arial" w:cs="Arial"/>
         </w:rPr>
-        <w:t xml:space="preserve">: Java, Spring </w:t>
+        <w:t xml:space="preserve">: Java, Spring Boot, PostgreSQL, </w:t>
       </w:r>
       <w:proofErr w:type="spellStart"/>
       <w:r>
         <w:rPr>
           <w:rFonts w:ascii="Arial" w:hAnsi="Arial" w:cs="Arial"/>
         </w:rPr>
-        <w:t>Boot</w:t>
+        <w:t>intellJide</w:t>
       </w:r>
       <w:proofErr w:type="spellEnd"/>
       <w:r>
@@ -2846,34 +2652,6 @@
         </w:rPr>
         <w:t xml:space="preserve">, </w:t>
       </w:r>
-      <w:proofErr w:type="spellStart"/>
-      <w:r>
-        <w:rPr>
-          <w:rFonts w:ascii="Arial" w:hAnsi="Arial" w:cs="Arial"/>
-        </w:rPr>
-        <w:t>PostgreSQL</w:t>
-      </w:r>
-      <w:proofErr w:type="spellEnd"/>
-      <w:r>
-        <w:rPr>
-          <w:rFonts w:ascii="Arial" w:hAnsi="Arial" w:cs="Arial"/>
-        </w:rPr>
-        <w:t xml:space="preserve">, </w:t>
-      </w:r>
-      <w:proofErr w:type="spellStart"/>
-      <w:r>
-        <w:rPr>
-          <w:rFonts w:ascii="Arial" w:hAnsi="Arial" w:cs="Arial"/>
-        </w:rPr>
-        <w:t>intellJide</w:t>
-      </w:r>
-      <w:proofErr w:type="spellEnd"/>
-      <w:r>
-        <w:rPr>
-          <w:rFonts w:ascii="Arial" w:hAnsi="Arial" w:cs="Arial"/>
-        </w:rPr>
-        <w:t xml:space="preserve">, </w:t>
-      </w:r>
       <w:r>
         <w:rPr>
           <w:rFonts w:ascii="Arial" w:hAnsi="Arial" w:cs="Arial"/>
@@ -2884,21 +2662,7 @@
         <w:rPr>
           <w:rFonts w:ascii="Arial" w:hAnsi="Arial" w:cs="Arial"/>
         </w:rPr>
-        <w:t xml:space="preserve"> </w:t>
-      </w:r>
-      <w:proofErr w:type="spellStart"/>
-      <w:r>
-        <w:rPr>
-          <w:rFonts w:ascii="Arial" w:hAnsi="Arial" w:cs="Arial"/>
-        </w:rPr>
-        <w:t>Bootstrap</w:t>
-      </w:r>
-      <w:proofErr w:type="spellEnd"/>
-      <w:r>
-        <w:rPr>
-          <w:rFonts w:ascii="Arial" w:hAnsi="Arial" w:cs="Arial"/>
-        </w:rPr>
-        <w:t>, JavaScript.</w:t>
+        <w:t xml:space="preserve"> Bootstrap, JavaScript.</w:t>
       </w:r>
     </w:p>
     <w:p>
@@ -2920,7 +2684,7 @@
       </w:pPr>
       <w:r>
         <w:rPr>
-          <w:rStyle w:val="Textoennegrita"/>
+          <w:rStyle w:val="Fuerte"/>
           <w:rFonts w:ascii="Arial" w:hAnsi="Arial" w:cs="Arial"/>
         </w:rPr>
         <w:t>Desarrollador de Software Independiente</w:t>
@@ -2933,7 +2697,7 @@
       </w:r>
       <w:r>
         <w:rPr>
-          <w:rStyle w:val="Textoennegrita"/>
+          <w:rStyle w:val="Fuerte"/>
           <w:rFonts w:ascii="Arial" w:hAnsi="Arial" w:cs="Arial"/>
         </w:rPr>
         <w:t>Funciones</w:t>
@@ -3027,35 +2791,7 @@
         <w:rPr>
           <w:rFonts w:ascii="Arial" w:hAnsi="Arial" w:cs="Arial"/>
         </w:rPr>
-        <w:t xml:space="preserve">Diseño y desarrollo de sitios web con HTML5, </w:t>
-      </w:r>
-      <w:proofErr w:type="spellStart"/>
-      <w:r>
-        <w:rPr>
-          <w:rFonts w:ascii="Arial" w:hAnsi="Arial" w:cs="Arial"/>
-        </w:rPr>
-        <w:t>Bootstrap</w:t>
-      </w:r>
-      <w:proofErr w:type="spellEnd"/>
-      <w:r>
-        <w:rPr>
-          <w:rFonts w:ascii="Arial" w:hAnsi="Arial" w:cs="Arial"/>
-        </w:rPr>
-        <w:t xml:space="preserve">, JavaScript, </w:t>
-      </w:r>
-      <w:proofErr w:type="spellStart"/>
-      <w:r>
-        <w:rPr>
-          <w:rFonts w:ascii="Arial" w:hAnsi="Arial" w:cs="Arial"/>
-        </w:rPr>
-        <w:t>jQuery</w:t>
-      </w:r>
-      <w:proofErr w:type="spellEnd"/>
-      <w:r>
-        <w:rPr>
-          <w:rFonts w:ascii="Arial" w:hAnsi="Arial" w:cs="Arial"/>
-        </w:rPr>
-        <w:t>, AJAX.</w:t>
+        <w:t>Diseño y desarrollo de sitios web con HTML5, Bootstrap, JavaScript, jQuery, AJAX.</w:t>
       </w:r>
     </w:p>
     <w:p>
@@ -3107,7 +2843,7 @@
       </w:pPr>
       <w:r>
         <w:rPr>
-          <w:rStyle w:val="Textoennegrita"/>
+          <w:rStyle w:val="Fuerte"/>
           <w:rFonts w:ascii="Arial" w:hAnsi="Arial" w:cs="Arial"/>
         </w:rPr>
         <w:t>Tecnologías Utilizadas</w:t>
@@ -3144,35 +2880,7 @@
         <w:rPr>
           <w:rFonts w:ascii="Arial" w:hAnsi="Arial" w:cs="Arial"/>
         </w:rPr>
-        <w:t xml:space="preserve"> SOAP, HTML5, </w:t>
-      </w:r>
-      <w:proofErr w:type="spellStart"/>
-      <w:r>
-        <w:rPr>
-          <w:rFonts w:ascii="Arial" w:hAnsi="Arial" w:cs="Arial"/>
-        </w:rPr>
-        <w:t>Bootstrap</w:t>
-      </w:r>
-      <w:proofErr w:type="spellEnd"/>
-      <w:r>
-        <w:rPr>
-          <w:rFonts w:ascii="Arial" w:hAnsi="Arial" w:cs="Arial"/>
-        </w:rPr>
-        <w:t xml:space="preserve">, JavaScript, </w:t>
-      </w:r>
-      <w:proofErr w:type="spellStart"/>
-      <w:r>
-        <w:rPr>
-          <w:rFonts w:ascii="Arial" w:hAnsi="Arial" w:cs="Arial"/>
-        </w:rPr>
-        <w:t>jQuery</w:t>
-      </w:r>
-      <w:proofErr w:type="spellEnd"/>
-      <w:r>
-        <w:rPr>
-          <w:rFonts w:ascii="Arial" w:hAnsi="Arial" w:cs="Arial"/>
-        </w:rPr>
-        <w:t>, AJAX, SQL Server, Oracle.</w:t>
+        <w:t xml:space="preserve"> SOAP, HTML5, Bootstrap, JavaScript, jQuery, AJAX, SQL Server, Oracle.</w:t>
       </w:r>
     </w:p>
     <w:p>
@@ -3204,7 +2912,7 @@
       </w:pPr>
       <w:r>
         <w:rPr>
-          <w:rStyle w:val="Textoennegrita"/>
+          <w:rStyle w:val="Fuerte"/>
           <w:rFonts w:ascii="Arial" w:hAnsi="Arial" w:cs="Arial"/>
         </w:rPr>
         <w:t>Ingeniero de Sistemas – Gobernación del Tolima</w:t>
@@ -3217,7 +2925,7 @@
       </w:r>
       <w:r>
         <w:rPr>
-          <w:rStyle w:val="Textoennegrita"/>
+          <w:rStyle w:val="Fuerte"/>
           <w:rFonts w:ascii="Arial" w:hAnsi="Arial" w:cs="Arial"/>
         </w:rPr>
         <w:t>Funciones</w:t>
@@ -3246,6 +2954,7 @@
         <w:rPr>
           <w:rFonts w:ascii="Arial" w:hAnsi="Arial" w:cs="Arial"/>
         </w:rPr>
+        <w:lastRenderedPageBreak/>
         <w:t>Apoyo en la actualización de la base de datos de cobro administrativo coactivo del Departamento Administrativo de Tránsito y Transporte del Tolima.</w:t>
       </w:r>
     </w:p>
@@ -3266,7 +2975,6 @@
         <w:rPr>
           <w:rFonts w:ascii="Arial" w:hAnsi="Arial" w:cs="Arial"/>
         </w:rPr>
-        <w:lastRenderedPageBreak/>
         <w:t>Generación y carga de archivos planos para actualizar la plataforma tecnológica SIMIT (Sistema Integrado de Información sobre los Comparendos).</w:t>
       </w:r>
     </w:p>
@@ -3281,7 +2989,7 @@
       </w:pPr>
       <w:r>
         <w:rPr>
-          <w:rStyle w:val="Textoennegrita"/>
+          <w:rStyle w:val="Fuerte"/>
           <w:rFonts w:ascii="Arial" w:hAnsi="Arial" w:cs="Arial"/>
         </w:rPr>
         <w:t>Tecnologías Utilizadas</w:t>
@@ -3302,7 +3010,7 @@
       </w:pPr>
       <w:r>
         <w:rPr>
-          <w:rStyle w:val="Textoennegrita"/>
+          <w:rStyle w:val="Fuerte"/>
           <w:rFonts w:ascii="Arial" w:hAnsi="Arial" w:cs="Arial"/>
         </w:rPr>
         <w:t xml:space="preserve">Desarrollador de Software – </w:t>
@@ -3310,7 +3018,7 @@
       <w:proofErr w:type="spellStart"/>
       <w:r>
         <w:rPr>
-          <w:rStyle w:val="Textoennegrita"/>
+          <w:rStyle w:val="Fuerte"/>
           <w:rFonts w:ascii="Arial" w:hAnsi="Arial" w:cs="Arial"/>
         </w:rPr>
         <w:t>TurriSystem</w:t>
@@ -3318,7 +3026,7 @@
       <w:proofErr w:type="spellEnd"/>
       <w:r>
         <w:rPr>
-          <w:rStyle w:val="Textoennegrita"/>
+          <w:rStyle w:val="Fuerte"/>
           <w:rFonts w:ascii="Arial" w:hAnsi="Arial" w:cs="Arial"/>
         </w:rPr>
         <w:t xml:space="preserve"> Ltda.</w:t>
@@ -3331,7 +3039,7 @@
       </w:r>
       <w:r>
         <w:rPr>
-          <w:rStyle w:val="Textoennegrita"/>
+          <w:rStyle w:val="Fuerte"/>
           <w:rFonts w:ascii="Arial" w:hAnsi="Arial" w:cs="Arial"/>
         </w:rPr>
         <w:t>Funciones</w:t>
@@ -3434,35 +3142,7 @@
         <w:rPr>
           <w:rFonts w:ascii="Arial" w:hAnsi="Arial" w:cs="Arial"/>
         </w:rPr>
-        <w:t>Desarrollo tanto del Back-</w:t>
-      </w:r>
-      <w:proofErr w:type="spellStart"/>
-      <w:r>
-        <w:rPr>
-          <w:rFonts w:ascii="Arial" w:hAnsi="Arial" w:cs="Arial"/>
-        </w:rPr>
-        <w:t>End</w:t>
-      </w:r>
-      <w:proofErr w:type="spellEnd"/>
-      <w:r>
-        <w:rPr>
-          <w:rFonts w:ascii="Arial" w:hAnsi="Arial" w:cs="Arial"/>
-        </w:rPr>
-        <w:t xml:space="preserve"> como del Front-</w:t>
-      </w:r>
-      <w:proofErr w:type="spellStart"/>
-      <w:r>
-        <w:rPr>
-          <w:rFonts w:ascii="Arial" w:hAnsi="Arial" w:cs="Arial"/>
-        </w:rPr>
-        <w:t>End</w:t>
-      </w:r>
-      <w:proofErr w:type="spellEnd"/>
-      <w:r>
-        <w:rPr>
-          <w:rFonts w:ascii="Arial" w:hAnsi="Arial" w:cs="Arial"/>
-        </w:rPr>
-        <w:t xml:space="preserve"> de aplicaciones.</w:t>
+        <w:t>Desarrollo tanto del Back-End como del Front-End de aplicaciones.</w:t>
       </w:r>
     </w:p>
     <w:p>
@@ -3492,98 +3172,68 @@
         <w:ind w:left="720"/>
         <w:rPr>
           <w:rFonts w:ascii="Arial" w:hAnsi="Arial" w:cs="Arial"/>
-        </w:rPr>
-      </w:pPr>
-      <w:r>
-        <w:rPr>
-          <w:rStyle w:val="Textoennegrita"/>
-          <w:rFonts w:ascii="Arial" w:hAnsi="Arial" w:cs="Arial"/>
-        </w:rPr>
-        <w:t>Tecnologías Utilizadas</w:t>
-      </w:r>
-      <w:r>
-        <w:rPr>
-          <w:rFonts w:ascii="Arial" w:hAnsi="Arial" w:cs="Arial"/>
-        </w:rPr>
-        <w:t xml:space="preserve">: .NET, </w:t>
-      </w:r>
+          <w:lang w:val="en-US"/>
+        </w:rPr>
+      </w:pPr>
       <w:proofErr w:type="spellStart"/>
       <w:r>
         <w:rPr>
-          <w:rFonts w:ascii="Arial" w:hAnsi="Arial" w:cs="Arial"/>
-        </w:rPr>
-        <w:t>Entity</w:t>
+          <w:rStyle w:val="Fuerte"/>
+          <w:rFonts w:ascii="Arial" w:hAnsi="Arial" w:cs="Arial"/>
+          <w:lang w:val="en-US"/>
+        </w:rPr>
+        <w:t>Tecnologías</w:t>
       </w:r>
       <w:proofErr w:type="spellEnd"/>
       <w:r>
         <w:rPr>
-          <w:rFonts w:ascii="Arial" w:hAnsi="Arial" w:cs="Arial"/>
-        </w:rPr>
-        <w:t xml:space="preserve"> Framework, API, Web </w:t>
+          <w:rStyle w:val="Fuerte"/>
+          <w:rFonts w:ascii="Arial" w:hAnsi="Arial" w:cs="Arial"/>
+          <w:lang w:val="en-US"/>
+        </w:rPr>
+        <w:t xml:space="preserve"> </w:t>
       </w:r>
       <w:proofErr w:type="spellStart"/>
       <w:r>
         <w:rPr>
-          <w:rFonts w:ascii="Arial" w:hAnsi="Arial" w:cs="Arial"/>
-        </w:rPr>
-        <w:t>Services</w:t>
+          <w:rStyle w:val="Fuerte"/>
+          <w:rFonts w:ascii="Arial" w:hAnsi="Arial" w:cs="Arial"/>
+          <w:lang w:val="en-US"/>
+        </w:rPr>
+        <w:t>Utilizadas</w:t>
       </w:r>
       <w:proofErr w:type="spellEnd"/>
       <w:r>
         <w:rPr>
           <w:rFonts w:ascii="Arial" w:hAnsi="Arial" w:cs="Arial"/>
-        </w:rPr>
-        <w:t xml:space="preserve"> SOAP, SQL Server, HTML5, </w:t>
+          <w:lang w:val="en-US"/>
+        </w:rPr>
+        <w:t xml:space="preserve">: .NET, Entity Framework, API, Web Services SOAP, SQL Server, HTML5, Bootstrap, Angular, JavaScript, jQuery, TypeScript, NPM, Angular CLI, .NET Core, </w:t>
       </w:r>
       <w:proofErr w:type="spellStart"/>
       <w:r>
         <w:rPr>
           <w:rFonts w:ascii="Arial" w:hAnsi="Arial" w:cs="Arial"/>
-        </w:rPr>
-        <w:t>Bootstrap</w:t>
+          <w:lang w:val="en-US"/>
+        </w:rPr>
+        <w:t>arquitectura</w:t>
       </w:r>
       <w:proofErr w:type="spellEnd"/>
       <w:r>
         <w:rPr>
           <w:rFonts w:ascii="Arial" w:hAnsi="Arial" w:cs="Arial"/>
-        </w:rPr>
-        <w:t xml:space="preserve">, Angular, JavaScript, </w:t>
-      </w:r>
-      <w:proofErr w:type="spellStart"/>
-      <w:r>
-        <w:rPr>
-          <w:rFonts w:ascii="Arial" w:hAnsi="Arial" w:cs="Arial"/>
-        </w:rPr>
-        <w:t>jQuery</w:t>
-      </w:r>
-      <w:proofErr w:type="spellEnd"/>
-      <w:r>
-        <w:rPr>
-          <w:rFonts w:ascii="Arial" w:hAnsi="Arial" w:cs="Arial"/>
-        </w:rPr>
-        <w:t xml:space="preserve">, </w:t>
-      </w:r>
-      <w:proofErr w:type="spellStart"/>
-      <w:r>
-        <w:rPr>
-          <w:rFonts w:ascii="Arial" w:hAnsi="Arial" w:cs="Arial"/>
-        </w:rPr>
-        <w:t>TypeScript</w:t>
-      </w:r>
-      <w:proofErr w:type="spellEnd"/>
-      <w:r>
-        <w:rPr>
-          <w:rFonts w:ascii="Arial" w:hAnsi="Arial" w:cs="Arial"/>
-        </w:rPr>
-        <w:t>, NPM, Angular CLI, .NET Core, arquitectura SOA, SCRUM.</w:t>
+          <w:lang w:val="en-US"/>
+        </w:rPr>
+        <w:t xml:space="preserve"> SOA, SCRUM.</w:t>
       </w:r>
     </w:p>
     <w:p>
       <w:pPr>
         <w:pStyle w:val="NormalWeb"/>
         <w:rPr>
-          <w:rStyle w:val="Textoennegrita"/>
-          <w:rFonts w:ascii="Arial" w:hAnsi="Arial" w:cs="Arial"/>
+          <w:rStyle w:val="Fuerte"/>
+          <w:rFonts w:ascii="Arial" w:hAnsi="Arial" w:cs="Arial"/>
+          <w:lang w:val="en-US"/>
         </w:rPr>
       </w:pPr>
     </w:p>
@@ -3596,7 +3246,7 @@
       </w:pPr>
       <w:r>
         <w:rPr>
-          <w:rStyle w:val="Textoennegrita"/>
+          <w:rStyle w:val="Fuerte"/>
           <w:rFonts w:ascii="Arial" w:hAnsi="Arial" w:cs="Arial"/>
         </w:rPr>
         <w:t>Docente de Secundaria - Magisterio Nacional</w:t>
@@ -3609,7 +3259,7 @@
       </w:r>
       <w:r>
         <w:rPr>
-          <w:rStyle w:val="Textoennegrita"/>
+          <w:rStyle w:val="Fuerte"/>
           <w:rFonts w:ascii="Arial" w:hAnsi="Arial" w:cs="Arial"/>
         </w:rPr>
         <w:t>Funciones</w:t>
@@ -3720,7 +3370,7 @@
       </w:pPr>
       <w:r>
         <w:rPr>
-          <w:rStyle w:val="Textoennegrita"/>
+          <w:rStyle w:val="Fuerte"/>
           <w:rFonts w:ascii="Arial" w:hAnsi="Arial" w:cs="Arial"/>
         </w:rPr>
         <w:t>Conocimientos y Habilidades:</w:t>
@@ -3743,6 +3393,7 @@
         <w:rPr>
           <w:rFonts w:ascii="Arial" w:hAnsi="Arial" w:cs="Arial"/>
         </w:rPr>
+        <w:lastRenderedPageBreak/>
         <w:t xml:space="preserve">Lenguajes de Programación: Java, C#, .NET, Python, PHP, JavaScript, </w:t>
       </w:r>
       <w:proofErr w:type="spellStart"/>
@@ -3777,36 +3428,7 @@
         <w:rPr>
           <w:rFonts w:ascii="Arial" w:hAnsi="Arial" w:cs="Arial"/>
         </w:rPr>
-        <w:lastRenderedPageBreak/>
-        <w:t xml:space="preserve">Desarrollo Web: HTML5, CSS3, Angular, React.js, Vue.js, Vanilla.js, </w:t>
-      </w:r>
-      <w:proofErr w:type="spellStart"/>
-      <w:r>
-        <w:rPr>
-          <w:rFonts w:ascii="Arial" w:hAnsi="Arial" w:cs="Arial"/>
-        </w:rPr>
-        <w:t>Bootstrap</w:t>
-      </w:r>
-      <w:proofErr w:type="spellEnd"/>
-      <w:r>
-        <w:rPr>
-          <w:rFonts w:ascii="Arial" w:hAnsi="Arial" w:cs="Arial"/>
-        </w:rPr>
-        <w:t xml:space="preserve">, </w:t>
-      </w:r>
-      <w:proofErr w:type="spellStart"/>
-      <w:r>
-        <w:rPr>
-          <w:rFonts w:ascii="Arial" w:hAnsi="Arial" w:cs="Arial"/>
-        </w:rPr>
-        <w:t>jQuery</w:t>
-      </w:r>
-      <w:proofErr w:type="spellEnd"/>
-      <w:r>
-        <w:rPr>
-          <w:rFonts w:ascii="Arial" w:hAnsi="Arial" w:cs="Arial"/>
-        </w:rPr>
-        <w:t>, AJAX.</w:t>
+        <w:t>Desarrollo Web: HTML5, CSS3, Angular, React.js, Vue.js, Vanilla.js, Bootstrap, jQuery, AJAX.</w:t>
       </w:r>
     </w:p>
     <w:p>
@@ -3826,63 +3448,7 @@
         <w:rPr>
           <w:rFonts w:ascii="Arial" w:hAnsi="Arial" w:cs="Arial"/>
         </w:rPr>
-        <w:t xml:space="preserve">Bases de Datos: SQL Server, </w:t>
-      </w:r>
-      <w:proofErr w:type="spellStart"/>
-      <w:r>
-        <w:rPr>
-          <w:rFonts w:ascii="Arial" w:hAnsi="Arial" w:cs="Arial"/>
-        </w:rPr>
-        <w:t>MySQL</w:t>
-      </w:r>
-      <w:proofErr w:type="spellEnd"/>
-      <w:r>
-        <w:rPr>
-          <w:rFonts w:ascii="Arial" w:hAnsi="Arial" w:cs="Arial"/>
-        </w:rPr>
-        <w:t xml:space="preserve">, </w:t>
-      </w:r>
-      <w:proofErr w:type="spellStart"/>
-      <w:r>
-        <w:rPr>
-          <w:rFonts w:ascii="Arial" w:hAnsi="Arial" w:cs="Arial"/>
-        </w:rPr>
-        <w:t>PostgreSQL</w:t>
-      </w:r>
-      <w:proofErr w:type="spellEnd"/>
-      <w:r>
-        <w:rPr>
-          <w:rFonts w:ascii="Arial" w:hAnsi="Arial" w:cs="Arial"/>
-        </w:rPr>
-        <w:t xml:space="preserve">, Oracle, </w:t>
-      </w:r>
-      <w:proofErr w:type="spellStart"/>
-      <w:r>
-        <w:rPr>
-          <w:rFonts w:ascii="Arial" w:hAnsi="Arial" w:cs="Arial"/>
-        </w:rPr>
-        <w:t>MongoDB</w:t>
-      </w:r>
-      <w:proofErr w:type="spellEnd"/>
-      <w:r>
-        <w:rPr>
-          <w:rFonts w:ascii="Arial" w:hAnsi="Arial" w:cs="Arial"/>
-        </w:rPr>
-        <w:t xml:space="preserve">, Microsoft </w:t>
-      </w:r>
-      <w:proofErr w:type="spellStart"/>
-      <w:r>
-        <w:rPr>
-          <w:rFonts w:ascii="Arial" w:hAnsi="Arial" w:cs="Arial"/>
-        </w:rPr>
-        <w:t>Azure</w:t>
-      </w:r>
-      <w:proofErr w:type="spellEnd"/>
-      <w:r>
-        <w:rPr>
-          <w:rFonts w:ascii="Arial" w:hAnsi="Arial" w:cs="Arial"/>
-        </w:rPr>
-        <w:t>.</w:t>
+        <w:t>Bases de Datos: SQL Server, MySQL, PostgreSQL, Oracle, MongoDB, Microsoft Azure.</w:t>
       </w:r>
     </w:p>
     <w:p>
@@ -3922,49 +3488,7 @@
         <w:rPr>
           <w:rFonts w:ascii="Arial" w:hAnsi="Arial" w:cs="Arial"/>
         </w:rPr>
-        <w:t xml:space="preserve">Herramientas: </w:t>
-      </w:r>
-      <w:proofErr w:type="spellStart"/>
-      <w:r>
-        <w:rPr>
-          <w:rFonts w:ascii="Arial" w:hAnsi="Arial" w:cs="Arial"/>
-        </w:rPr>
-        <w:t>Git</w:t>
-      </w:r>
-      <w:proofErr w:type="spellEnd"/>
-      <w:r>
-        <w:rPr>
-          <w:rFonts w:ascii="Arial" w:hAnsi="Arial" w:cs="Arial"/>
-        </w:rPr>
-        <w:t xml:space="preserve">, Visual Studio, Eclipse, </w:t>
-      </w:r>
-      <w:proofErr w:type="spellStart"/>
-      <w:r>
-        <w:rPr>
-          <w:rFonts w:ascii="Arial" w:hAnsi="Arial" w:cs="Arial"/>
-        </w:rPr>
-        <w:t>IntelliJ</w:t>
-      </w:r>
-      <w:proofErr w:type="spellEnd"/>
-      <w:r>
-        <w:rPr>
-          <w:rFonts w:ascii="Arial" w:hAnsi="Arial" w:cs="Arial"/>
-        </w:rPr>
-        <w:t xml:space="preserve"> IDEA, Node.js, NPM, </w:t>
-      </w:r>
-      <w:proofErr w:type="spellStart"/>
-      <w:r>
-        <w:rPr>
-          <w:rFonts w:ascii="Arial" w:hAnsi="Arial" w:cs="Arial"/>
-        </w:rPr>
-        <w:t>Docker</w:t>
-      </w:r>
-      <w:proofErr w:type="spellEnd"/>
-      <w:r>
-        <w:rPr>
-          <w:rFonts w:ascii="Arial" w:hAnsi="Arial" w:cs="Arial"/>
-        </w:rPr>
-        <w:t>.</w:t>
+        <w:t>Herramientas: Git, Visual Studio, Eclipse, IntelliJ IDEA, Node.js, NPM, Docker.</w:t>
       </w:r>
     </w:p>
     <w:p>
@@ -3978,55 +3502,31 @@
         <w:ind w:left="714" w:hanging="357"/>
         <w:rPr>
           <w:rFonts w:ascii="Arial" w:hAnsi="Arial" w:cs="Arial"/>
-        </w:rPr>
-      </w:pPr>
-      <w:r>
-        <w:rPr>
-          <w:rFonts w:ascii="Arial" w:hAnsi="Arial" w:cs="Arial"/>
-        </w:rPr>
-        <w:t>Sistemas Operativos: Linux (</w:t>
+          <w:lang w:val="en-US"/>
+        </w:rPr>
+      </w:pPr>
+      <w:r>
+        <w:rPr>
+          <w:rFonts w:ascii="Arial" w:hAnsi="Arial" w:cs="Arial"/>
+          <w:lang w:val="en-US"/>
+        </w:rPr>
+        <w:t xml:space="preserve">Sistemas </w:t>
       </w:r>
       <w:proofErr w:type="spellStart"/>
       <w:r>
         <w:rPr>
           <w:rFonts w:ascii="Arial" w:hAnsi="Arial" w:cs="Arial"/>
-        </w:rPr>
-        <w:t>RedHat</w:t>
+          <w:lang w:val="en-US"/>
+        </w:rPr>
+        <w:t>Operativos</w:t>
       </w:r>
       <w:proofErr w:type="spellEnd"/>
       <w:r>
         <w:rPr>
           <w:rFonts w:ascii="Arial" w:hAnsi="Arial" w:cs="Arial"/>
-        </w:rPr>
-        <w:t xml:space="preserve">, Ubuntu, </w:t>
-      </w:r>
-      <w:proofErr w:type="spellStart"/>
-      <w:r>
-        <w:rPr>
-          <w:rFonts w:ascii="Arial" w:hAnsi="Arial" w:cs="Arial"/>
-        </w:rPr>
-        <w:t>Kali</w:t>
-      </w:r>
-      <w:proofErr w:type="spellEnd"/>
-      <w:r>
-        <w:rPr>
-          <w:rFonts w:ascii="Arial" w:hAnsi="Arial" w:cs="Arial"/>
-        </w:rPr>
-        <w:t xml:space="preserve">, </w:t>
-      </w:r>
-      <w:proofErr w:type="spellStart"/>
-      <w:r>
-        <w:rPr>
-          <w:rFonts w:ascii="Arial" w:hAnsi="Arial" w:cs="Arial"/>
-        </w:rPr>
-        <w:t>Parrot</w:t>
-      </w:r>
-      <w:proofErr w:type="spellEnd"/>
-      <w:r>
-        <w:rPr>
-          <w:rFonts w:ascii="Arial" w:hAnsi="Arial" w:cs="Arial"/>
-        </w:rPr>
-        <w:t xml:space="preserve"> Security), Windows.</w:t>
+          <w:lang w:val="en-US"/>
+        </w:rPr>
+        <w:t>: Linux (RedHat, Ubuntu, Kali, Parrot Security), Windows.</w:t>
       </w:r>
     </w:p>
     <w:p>
@@ -4067,7 +3567,7 @@
       </w:pPr>
       <w:r>
         <w:rPr>
-          <w:rStyle w:val="Textoennegrita"/>
+          <w:rStyle w:val="Fuerte"/>
           <w:rFonts w:ascii="Arial" w:hAnsi="Arial" w:cs="Arial"/>
         </w:rPr>
         <w:t>Idiomas:</w:t>
@@ -4100,7 +3600,7 @@
       </w:pPr>
       <w:r>
         <w:rPr>
-          <w:rStyle w:val="Textoennegrita"/>
+          <w:rStyle w:val="Fuerte"/>
           <w:rFonts w:ascii="Arial" w:hAnsi="Arial" w:cs="Arial"/>
         </w:rPr>
         <w:t>Referencias:</w:t>
@@ -4120,7 +3620,7 @@
       </w:pPr>
       <w:r>
         <w:rPr>
-          <w:rStyle w:val="Textoennegrita"/>
+          <w:rStyle w:val="Fuerte"/>
           <w:rFonts w:ascii="Arial" w:hAnsi="Arial" w:cs="Arial"/>
         </w:rPr>
         <w:t>Ing. Julián Bastidas</w:t>
@@ -4146,7 +3646,7 @@
       </w:pPr>
       <w:r>
         <w:rPr>
-          <w:rStyle w:val="Textoennegrita"/>
+          <w:rStyle w:val="Fuerte"/>
           <w:rFonts w:ascii="Arial" w:hAnsi="Arial" w:cs="Arial"/>
         </w:rPr>
         <w:t>Ing. Albeiro Zuluaga Montes</w:t>
@@ -4172,7 +3672,7 @@
       </w:pPr>
       <w:r>
         <w:rPr>
-          <w:rStyle w:val="Textoennegrita"/>
+          <w:rStyle w:val="Fuerte"/>
           <w:rFonts w:ascii="Arial" w:hAnsi="Arial" w:cs="Arial"/>
         </w:rPr>
         <w:t>Dr. Juan Mario Laguna</w:t>
@@ -4207,396 +3707,6 @@
     <w:p>
       <w:pPr>
         <w:spacing w:after="0" w:line="240" w:lineRule="auto"/>
-        <w:ind w:left="709" w:firstLine="425"/>
-        <w:jc w:val="both"/>
-        <w:rPr>
-          <w:rFonts w:ascii="Arial" w:eastAsia="Tahoma" w:hAnsi="Arial" w:cs="Arial"/>
-        </w:rPr>
-      </w:pPr>
-    </w:p>
-    <w:p>
-      <w:pPr>
-        <w:spacing w:after="0" w:line="240" w:lineRule="auto"/>
-        <w:ind w:left="709" w:firstLine="425"/>
-        <w:jc w:val="both"/>
-        <w:rPr>
-          <w:rFonts w:ascii="Arial" w:eastAsia="Tahoma" w:hAnsi="Arial" w:cs="Arial"/>
-        </w:rPr>
-      </w:pPr>
-    </w:p>
-    <w:p>
-      <w:pPr>
-        <w:spacing w:after="0" w:line="240" w:lineRule="auto"/>
-        <w:ind w:left="709" w:firstLine="425"/>
-        <w:jc w:val="both"/>
-        <w:rPr>
-          <w:rFonts w:ascii="Arial" w:eastAsia="Tahoma" w:hAnsi="Arial" w:cs="Arial"/>
-        </w:rPr>
-      </w:pPr>
-    </w:p>
-    <w:p>
-      <w:pPr>
-        <w:spacing w:after="0" w:line="240" w:lineRule="auto"/>
-        <w:ind w:left="709" w:firstLine="425"/>
-        <w:jc w:val="both"/>
-        <w:rPr>
-          <w:rFonts w:ascii="Arial" w:eastAsia="Tahoma" w:hAnsi="Arial" w:cs="Arial"/>
-        </w:rPr>
-      </w:pPr>
-    </w:p>
-    <w:p>
-      <w:pPr>
-        <w:spacing w:after="0" w:line="240" w:lineRule="auto"/>
-        <w:ind w:left="709" w:firstLine="425"/>
-        <w:jc w:val="both"/>
-        <w:rPr>
-          <w:rFonts w:ascii="Arial" w:eastAsia="Tahoma" w:hAnsi="Arial" w:cs="Arial"/>
-        </w:rPr>
-      </w:pPr>
-    </w:p>
-    <w:p>
-      <w:pPr>
-        <w:spacing w:after="0" w:line="240" w:lineRule="auto"/>
-        <w:ind w:left="709" w:firstLine="425"/>
-        <w:jc w:val="both"/>
-        <w:rPr>
-          <w:rFonts w:ascii="Arial" w:eastAsia="Tahoma" w:hAnsi="Arial" w:cs="Arial"/>
-        </w:rPr>
-      </w:pPr>
-    </w:p>
-    <w:p>
-      <w:pPr>
-        <w:spacing w:after="0" w:line="240" w:lineRule="auto"/>
-        <w:ind w:left="709" w:firstLine="425"/>
-        <w:jc w:val="both"/>
-        <w:rPr>
-          <w:rFonts w:ascii="Arial" w:eastAsia="Tahoma" w:hAnsi="Arial" w:cs="Arial"/>
-        </w:rPr>
-      </w:pPr>
-    </w:p>
-    <w:p>
-      <w:pPr>
-        <w:spacing w:after="0" w:line="240" w:lineRule="auto"/>
-        <w:ind w:left="709" w:firstLine="425"/>
-        <w:jc w:val="both"/>
-        <w:rPr>
-          <w:rFonts w:ascii="Arial" w:eastAsia="Tahoma" w:hAnsi="Arial" w:cs="Arial"/>
-        </w:rPr>
-      </w:pPr>
-    </w:p>
-    <w:p>
-      <w:pPr>
-        <w:spacing w:after="0" w:line="240" w:lineRule="auto"/>
-        <w:ind w:left="709" w:firstLine="425"/>
-        <w:jc w:val="both"/>
-        <w:rPr>
-          <w:rFonts w:ascii="Arial" w:eastAsia="Tahoma" w:hAnsi="Arial" w:cs="Arial"/>
-        </w:rPr>
-      </w:pPr>
-    </w:p>
-    <w:p>
-      <w:pPr>
-        <w:spacing w:after="0" w:line="240" w:lineRule="auto"/>
-        <w:ind w:left="709" w:firstLine="425"/>
-        <w:jc w:val="both"/>
-        <w:rPr>
-          <w:rFonts w:ascii="Arial" w:eastAsia="Tahoma" w:hAnsi="Arial" w:cs="Arial"/>
-        </w:rPr>
-      </w:pPr>
-    </w:p>
-    <w:p>
-      <w:pPr>
-        <w:spacing w:after="0" w:line="240" w:lineRule="auto"/>
-        <w:ind w:left="709" w:firstLine="425"/>
-        <w:jc w:val="both"/>
-        <w:rPr>
-          <w:rFonts w:ascii="Arial" w:eastAsia="Tahoma" w:hAnsi="Arial" w:cs="Arial"/>
-        </w:rPr>
-      </w:pPr>
-    </w:p>
-    <w:p>
-      <w:pPr>
-        <w:spacing w:after="0" w:line="240" w:lineRule="auto"/>
-        <w:ind w:left="709" w:firstLine="425"/>
-        <w:jc w:val="both"/>
-        <w:rPr>
-          <w:rFonts w:ascii="Arial" w:eastAsia="Tahoma" w:hAnsi="Arial" w:cs="Arial"/>
-        </w:rPr>
-      </w:pPr>
-    </w:p>
-    <w:p>
-      <w:pPr>
-        <w:spacing w:after="0" w:line="240" w:lineRule="auto"/>
-        <w:ind w:left="709" w:firstLine="425"/>
-        <w:jc w:val="both"/>
-        <w:rPr>
-          <w:rFonts w:ascii="Arial" w:eastAsia="Tahoma" w:hAnsi="Arial" w:cs="Arial"/>
-        </w:rPr>
-      </w:pPr>
-    </w:p>
-    <w:p>
-      <w:pPr>
-        <w:spacing w:after="0" w:line="240" w:lineRule="auto"/>
-        <w:ind w:left="709" w:firstLine="425"/>
-        <w:jc w:val="both"/>
-        <w:rPr>
-          <w:rFonts w:ascii="Arial" w:eastAsia="Tahoma" w:hAnsi="Arial" w:cs="Arial"/>
-        </w:rPr>
-      </w:pPr>
-    </w:p>
-    <w:p>
-      <w:pPr>
-        <w:spacing w:after="0" w:line="240" w:lineRule="auto"/>
-        <w:ind w:left="709" w:firstLine="425"/>
-        <w:jc w:val="both"/>
-        <w:rPr>
-          <w:rFonts w:ascii="Arial" w:eastAsia="Tahoma" w:hAnsi="Arial" w:cs="Arial"/>
-        </w:rPr>
-      </w:pPr>
-    </w:p>
-    <w:p>
-      <w:pPr>
-        <w:spacing w:after="0" w:line="240" w:lineRule="auto"/>
-        <w:ind w:left="709" w:firstLine="425"/>
-        <w:jc w:val="both"/>
-        <w:rPr>
-          <w:rFonts w:ascii="Arial" w:eastAsia="Tahoma" w:hAnsi="Arial" w:cs="Arial"/>
-        </w:rPr>
-      </w:pPr>
-    </w:p>
-    <w:p>
-      <w:pPr>
-        <w:spacing w:after="0" w:line="240" w:lineRule="auto"/>
-        <w:ind w:left="709" w:firstLine="425"/>
-        <w:jc w:val="both"/>
-        <w:rPr>
-          <w:rFonts w:ascii="Arial" w:eastAsia="Tahoma" w:hAnsi="Arial" w:cs="Arial"/>
-        </w:rPr>
-      </w:pPr>
-    </w:p>
-    <w:p>
-      <w:pPr>
-        <w:spacing w:after="0" w:line="240" w:lineRule="auto"/>
-        <w:ind w:left="709" w:firstLine="425"/>
-        <w:jc w:val="both"/>
-        <w:rPr>
-          <w:rFonts w:ascii="Arial" w:eastAsia="Tahoma" w:hAnsi="Arial" w:cs="Arial"/>
-        </w:rPr>
-      </w:pPr>
-    </w:p>
-    <w:p>
-      <w:pPr>
-        <w:spacing w:after="0" w:line="240" w:lineRule="auto"/>
-        <w:ind w:left="709" w:firstLine="425"/>
-        <w:jc w:val="both"/>
-        <w:rPr>
-          <w:rFonts w:ascii="Arial" w:eastAsia="Tahoma" w:hAnsi="Arial" w:cs="Arial"/>
-        </w:rPr>
-      </w:pPr>
-    </w:p>
-    <w:p>
-      <w:pPr>
-        <w:spacing w:after="0" w:line="240" w:lineRule="auto"/>
-        <w:ind w:left="709" w:firstLine="425"/>
-        <w:jc w:val="both"/>
-        <w:rPr>
-          <w:rFonts w:ascii="Arial" w:eastAsia="Tahoma" w:hAnsi="Arial" w:cs="Arial"/>
-        </w:rPr>
-      </w:pPr>
-    </w:p>
-    <w:p>
-      <w:pPr>
-        <w:spacing w:after="0" w:line="240" w:lineRule="auto"/>
-        <w:ind w:left="709" w:firstLine="425"/>
-        <w:jc w:val="both"/>
-        <w:rPr>
-          <w:rFonts w:ascii="Arial" w:eastAsia="Tahoma" w:hAnsi="Arial" w:cs="Arial"/>
-        </w:rPr>
-      </w:pPr>
-    </w:p>
-    <w:p>
-      <w:pPr>
-        <w:spacing w:after="0" w:line="240" w:lineRule="auto"/>
-        <w:ind w:left="709" w:firstLine="425"/>
-        <w:jc w:val="both"/>
-        <w:rPr>
-          <w:rFonts w:ascii="Arial" w:eastAsia="Tahoma" w:hAnsi="Arial" w:cs="Arial"/>
-        </w:rPr>
-      </w:pPr>
-    </w:p>
-    <w:p>
-      <w:pPr>
-        <w:spacing w:after="0" w:line="240" w:lineRule="auto"/>
-        <w:ind w:left="709" w:firstLine="425"/>
-        <w:jc w:val="both"/>
-        <w:rPr>
-          <w:rFonts w:ascii="Arial" w:eastAsia="Tahoma" w:hAnsi="Arial" w:cs="Arial"/>
-        </w:rPr>
-      </w:pPr>
-    </w:p>
-    <w:p>
-      <w:pPr>
-        <w:spacing w:after="0" w:line="240" w:lineRule="auto"/>
-        <w:ind w:left="709" w:firstLine="425"/>
-        <w:jc w:val="both"/>
-        <w:rPr>
-          <w:rFonts w:ascii="Arial" w:eastAsia="Tahoma" w:hAnsi="Arial" w:cs="Arial"/>
-        </w:rPr>
-      </w:pPr>
-    </w:p>
-    <w:p>
-      <w:pPr>
-        <w:spacing w:after="0" w:line="240" w:lineRule="auto"/>
-        <w:ind w:left="709" w:firstLine="425"/>
-        <w:jc w:val="both"/>
-        <w:rPr>
-          <w:rFonts w:ascii="Arial" w:eastAsia="Tahoma" w:hAnsi="Arial" w:cs="Arial"/>
-        </w:rPr>
-      </w:pPr>
-    </w:p>
-    <w:p>
-      <w:pPr>
-        <w:spacing w:after="0" w:line="240" w:lineRule="auto"/>
-        <w:ind w:left="709" w:firstLine="425"/>
-        <w:jc w:val="both"/>
-        <w:rPr>
-          <w:rFonts w:ascii="Arial" w:eastAsia="Tahoma" w:hAnsi="Arial" w:cs="Arial"/>
-        </w:rPr>
-      </w:pPr>
-    </w:p>
-    <w:p>
-      <w:pPr>
-        <w:spacing w:after="0" w:line="240" w:lineRule="auto"/>
-        <w:ind w:left="709" w:firstLine="425"/>
-        <w:jc w:val="both"/>
-        <w:rPr>
-          <w:rFonts w:ascii="Arial" w:eastAsia="Tahoma" w:hAnsi="Arial" w:cs="Arial"/>
-        </w:rPr>
-      </w:pPr>
-    </w:p>
-    <w:p>
-      <w:pPr>
-        <w:spacing w:after="0" w:line="240" w:lineRule="auto"/>
-        <w:ind w:left="709" w:firstLine="425"/>
-        <w:jc w:val="both"/>
-        <w:rPr>
-          <w:rFonts w:ascii="Arial" w:eastAsia="Tahoma" w:hAnsi="Arial" w:cs="Arial"/>
-        </w:rPr>
-      </w:pPr>
-    </w:p>
-    <w:p>
-      <w:pPr>
-        <w:spacing w:after="0" w:line="240" w:lineRule="auto"/>
-        <w:ind w:left="709" w:firstLine="425"/>
-        <w:jc w:val="both"/>
-        <w:rPr>
-          <w:rFonts w:ascii="Arial" w:eastAsia="Tahoma" w:hAnsi="Arial" w:cs="Arial"/>
-        </w:rPr>
-      </w:pPr>
-    </w:p>
-    <w:p>
-      <w:pPr>
-        <w:spacing w:after="0" w:line="240" w:lineRule="auto"/>
-        <w:ind w:left="709" w:firstLine="425"/>
-        <w:jc w:val="both"/>
-        <w:rPr>
-          <w:rFonts w:ascii="Arial" w:eastAsia="Tahoma" w:hAnsi="Arial" w:cs="Arial"/>
-        </w:rPr>
-      </w:pPr>
-    </w:p>
-    <w:p>
-      <w:pPr>
-        <w:spacing w:after="0" w:line="240" w:lineRule="auto"/>
-        <w:ind w:left="709" w:firstLine="425"/>
-        <w:jc w:val="both"/>
-        <w:rPr>
-          <w:rFonts w:ascii="Arial" w:eastAsia="Tahoma" w:hAnsi="Arial" w:cs="Arial"/>
-        </w:rPr>
-      </w:pPr>
-    </w:p>
-    <w:p>
-      <w:pPr>
-        <w:spacing w:after="0" w:line="240" w:lineRule="auto"/>
-        <w:ind w:left="709" w:firstLine="425"/>
-        <w:jc w:val="both"/>
-        <w:rPr>
-          <w:rFonts w:ascii="Arial" w:eastAsia="Tahoma" w:hAnsi="Arial" w:cs="Arial"/>
-        </w:rPr>
-      </w:pPr>
-    </w:p>
-    <w:p>
-      <w:pPr>
-        <w:spacing w:after="0" w:line="240" w:lineRule="auto"/>
-        <w:ind w:left="709" w:firstLine="425"/>
-        <w:jc w:val="both"/>
-        <w:rPr>
-          <w:rFonts w:ascii="Arial" w:eastAsia="Tahoma" w:hAnsi="Arial" w:cs="Arial"/>
-        </w:rPr>
-      </w:pPr>
-    </w:p>
-    <w:p>
-      <w:pPr>
-        <w:spacing w:after="0" w:line="240" w:lineRule="auto"/>
-        <w:ind w:left="709" w:firstLine="425"/>
-        <w:jc w:val="both"/>
-        <w:rPr>
-          <w:rFonts w:ascii="Arial" w:eastAsia="Tahoma" w:hAnsi="Arial" w:cs="Arial"/>
-        </w:rPr>
-      </w:pPr>
-    </w:p>
-    <w:p>
-      <w:pPr>
-        <w:spacing w:after="0" w:line="240" w:lineRule="auto"/>
-        <w:ind w:left="709" w:firstLine="425"/>
-        <w:jc w:val="both"/>
-        <w:rPr>
-          <w:rFonts w:ascii="Arial" w:eastAsia="Tahoma" w:hAnsi="Arial" w:cs="Arial"/>
-        </w:rPr>
-      </w:pPr>
-    </w:p>
-    <w:p>
-      <w:pPr>
-        <w:spacing w:after="0" w:line="240" w:lineRule="auto"/>
-        <w:ind w:left="709" w:firstLine="425"/>
-        <w:jc w:val="both"/>
-        <w:rPr>
-          <w:rFonts w:ascii="Arial" w:eastAsia="Tahoma" w:hAnsi="Arial" w:cs="Arial"/>
-        </w:rPr>
-      </w:pPr>
-    </w:p>
-    <w:p>
-      <w:pPr>
-        <w:spacing w:after="0" w:line="240" w:lineRule="auto"/>
-        <w:ind w:left="709" w:firstLine="425"/>
-        <w:jc w:val="both"/>
-        <w:rPr>
-          <w:rFonts w:ascii="Arial" w:eastAsia="Tahoma" w:hAnsi="Arial" w:cs="Arial"/>
-        </w:rPr>
-      </w:pPr>
-    </w:p>
-    <w:p>
-      <w:pPr>
-        <w:spacing w:after="0" w:line="240" w:lineRule="auto"/>
-        <w:ind w:left="709" w:firstLine="425"/>
-        <w:jc w:val="both"/>
-        <w:rPr>
-          <w:rFonts w:ascii="Arial" w:eastAsia="Tahoma" w:hAnsi="Arial" w:cs="Arial"/>
-        </w:rPr>
-      </w:pPr>
-    </w:p>
-    <w:p>
-      <w:pPr>
-        <w:spacing w:after="0" w:line="240" w:lineRule="auto"/>
-        <w:ind w:left="709" w:firstLine="425"/>
-        <w:jc w:val="both"/>
-        <w:rPr>
-          <w:rFonts w:ascii="Arial" w:eastAsia="Tahoma" w:hAnsi="Arial" w:cs="Arial"/>
-        </w:rPr>
-      </w:pPr>
-    </w:p>
-    <w:p>
-      <w:pPr>
-        <w:spacing w:after="0" w:line="240" w:lineRule="auto"/>
         <w:jc w:val="center"/>
         <w:rPr>
           <w:rFonts w:ascii="Arial" w:eastAsia="Tahoma" w:hAnsi="Arial" w:cs="Arial"/>
@@ -4610,8 +3720,6 @@
         </w:rPr>
         <w:t>FIRMA DIGITAL</w:t>
       </w:r>
-      <w:bookmarkStart w:id="0" w:name="_GoBack"/>
-      <w:bookmarkEnd w:id="0"/>
     </w:p>
     <w:p>
       <w:pPr>
@@ -4700,7 +3808,7 @@
 </file>
 
 <file path=word/numbering.xml><?xml version="1.0" encoding="utf-8"?>
-<w:numbering xmlns:wpc="http://schemas.microsoft.com/office/word/2010/wordprocessingCanvas" xmlns:cx="http://schemas.microsoft.com/office/drawing/2014/chartex" xmlns:cx1="http://schemas.microsoft.com/office/drawing/2015/9/8/chartex" xmlns:mc="http://schemas.openxmlformats.org/markup-compatibility/2006" xmlns:o="urn:schemas-microsoft-com:office:office" xmlns:r="http://schemas.openxmlformats.org/officeDocument/2006/relationships" xmlns:m="http://schemas.openxmlformats.org/officeDocument/2006/math" xmlns:v="urn:schemas-microsoft-com:vml" xmlns:wp14="http://schemas.microsoft.com/office/word/2010/wordprocessingDrawing" xmlns:wp="http://schemas.openxmlformats.org/drawingml/2006/wordprocessingDrawing" xmlns:w10="urn:schemas-microsoft-com:office:word" xmlns:w="http://schemas.openxmlformats.org/wordprocessingml/2006/main" xmlns:w14="http://schemas.microsoft.com/office/word/2010/wordml" xmlns:w15="http://schemas.microsoft.com/office/word/2012/wordml" xmlns:w16se="http://schemas.microsoft.com/office/word/2015/wordml/symex" xmlns:wpg="http://schemas.microsoft.com/office/word/2010/wordprocessingGroup" xmlns:wpi="http://schemas.microsoft.com/office/word/2010/wordprocessingInk" xmlns:wne="http://schemas.microsoft.com/office/word/2006/wordml" xmlns:wps="http://schemas.microsoft.com/office/word/2010/wordprocessingShape" mc:Ignorable="w14 w15 w16se wp14">
+<w:numbering xmlns:wpc="http://schemas.microsoft.com/office/word/2010/wordprocessingCanvas" xmlns:cx="http://schemas.microsoft.com/office/drawing/2014/chartex" xmlns:cx1="http://schemas.microsoft.com/office/drawing/2015/9/8/chartex" xmlns:cx2="http://schemas.microsoft.com/office/drawing/2015/10/21/chartex" xmlns:cx3="http://schemas.microsoft.com/office/drawing/2016/5/9/chartex" xmlns:cx4="http://schemas.microsoft.com/office/drawing/2016/5/10/chartex" xmlns:cx5="http://schemas.microsoft.com/office/drawing/2016/5/11/chartex" xmlns:cx6="http://schemas.microsoft.com/office/drawing/2016/5/12/chartex" xmlns:cx7="http://schemas.microsoft.com/office/drawing/2016/5/13/chartex" xmlns:cx8="http://schemas.microsoft.com/office/drawing/2016/5/14/chartex" xmlns:mc="http://schemas.openxmlformats.org/markup-compatibility/2006" xmlns:aink="http://schemas.microsoft.com/office/drawing/2016/ink" xmlns:am3d="http://schemas.microsoft.com/office/drawing/2017/model3d" xmlns:o="urn:schemas-microsoft-com:office:office" xmlns:oel="http://schemas.microsoft.com/office/2019/extlst" xmlns:r="http://schemas.openxmlformats.org/officeDocument/2006/relationships" xmlns:m="http://schemas.openxmlformats.org/officeDocument/2006/math" xmlns:v="urn:schemas-microsoft-com:vml" xmlns:wp14="http://schemas.microsoft.com/office/word/2010/wordprocessingDrawing" xmlns:wp="http://schemas.openxmlformats.org/drawingml/2006/wordprocessingDrawing" xmlns:w10="urn:schemas-microsoft-com:office:word" xmlns:w="http://schemas.openxmlformats.org/wordprocessingml/2006/main" xmlns:w14="http://schemas.microsoft.com/office/word/2010/wordml" xmlns:w15="http://schemas.microsoft.com/office/word/2012/wordml" xmlns:w16cex="http://schemas.microsoft.com/office/word/2018/wordml/cex" xmlns:w16cid="http://schemas.microsoft.com/office/word/2016/wordml/cid" xmlns:w16="http://schemas.microsoft.com/office/word/2018/wordml" xmlns:w16du="http://schemas.microsoft.com/office/word/2023/wordml/word16du" xmlns:w16sdtdh="http://schemas.microsoft.com/office/word/2020/wordml/sdtdatahash" xmlns:w16sdtfl="http://schemas.microsoft.com/office/word/2024/wordml/sdtformatlock" xmlns:w16se="http://schemas.microsoft.com/office/word/2015/wordml/symex" xmlns:wpg="http://schemas.microsoft.com/office/word/2010/wordprocessingGroup" xmlns:wpi="http://schemas.microsoft.com/office/word/2010/wordprocessingInk" xmlns:wne="http://schemas.microsoft.com/office/word/2006/wordml" xmlns:wps="http://schemas.microsoft.com/office/word/2010/wordprocessingShape" mc:Ignorable="w14 w15 w16se w16cid w16 w16cex w16sdtdh w16sdtfl w16du wp14">
   <w:abstractNum w:abstractNumId="0" w15:restartNumberingAfterBreak="0">
     <w:nsid w:val="01AB28F4"/>
     <w:multiLevelType w:val="multilevel"/>
@@ -8983,113 +8091,113 @@
       <w:lvlJc w:val="left"/>
     </w:lvl>
   </w:abstractNum>
-  <w:num w:numId="1">
+  <w:num w:numId="1" w16cid:durableId="1486816803">
     <w:abstractNumId w:val="25"/>
   </w:num>
-  <w:num w:numId="2">
+  <w:num w:numId="2" w16cid:durableId="1376540160">
     <w:abstractNumId w:val="16"/>
   </w:num>
-  <w:num w:numId="3">
+  <w:num w:numId="3" w16cid:durableId="2043631219">
     <w:abstractNumId w:val="12"/>
   </w:num>
-  <w:num w:numId="4">
+  <w:num w:numId="4" w16cid:durableId="213081527">
     <w:abstractNumId w:val="15"/>
   </w:num>
-  <w:num w:numId="5">
+  <w:num w:numId="5" w16cid:durableId="1613047242">
     <w:abstractNumId w:val="28"/>
   </w:num>
-  <w:num w:numId="6">
+  <w:num w:numId="6" w16cid:durableId="935330307">
     <w:abstractNumId w:val="33"/>
   </w:num>
-  <w:num w:numId="7">
+  <w:num w:numId="7" w16cid:durableId="24797288">
     <w:abstractNumId w:val="1"/>
   </w:num>
-  <w:num w:numId="8">
+  <w:num w:numId="8" w16cid:durableId="986782364">
     <w:abstractNumId w:val="14"/>
   </w:num>
-  <w:num w:numId="9">
+  <w:num w:numId="9" w16cid:durableId="932321246">
     <w:abstractNumId w:val="9"/>
   </w:num>
-  <w:num w:numId="10">
+  <w:num w:numId="10" w16cid:durableId="1434209321">
     <w:abstractNumId w:val="22"/>
   </w:num>
-  <w:num w:numId="11">
+  <w:num w:numId="11" w16cid:durableId="1405686345">
     <w:abstractNumId w:val="2"/>
   </w:num>
-  <w:num w:numId="12">
+  <w:num w:numId="12" w16cid:durableId="437482024">
     <w:abstractNumId w:val="26"/>
   </w:num>
-  <w:num w:numId="13">
+  <w:num w:numId="13" w16cid:durableId="765536996">
     <w:abstractNumId w:val="29"/>
   </w:num>
-  <w:num w:numId="14">
+  <w:num w:numId="14" w16cid:durableId="1270428462">
     <w:abstractNumId w:val="13"/>
   </w:num>
-  <w:num w:numId="15">
+  <w:num w:numId="15" w16cid:durableId="1998531192">
     <w:abstractNumId w:val="27"/>
   </w:num>
-  <w:num w:numId="16">
+  <w:num w:numId="16" w16cid:durableId="621960756">
     <w:abstractNumId w:val="20"/>
   </w:num>
-  <w:num w:numId="17">
+  <w:num w:numId="17" w16cid:durableId="1493330906">
     <w:abstractNumId w:val="23"/>
   </w:num>
-  <w:num w:numId="18">
+  <w:num w:numId="18" w16cid:durableId="2026973893">
     <w:abstractNumId w:val="7"/>
   </w:num>
-  <w:num w:numId="19">
+  <w:num w:numId="19" w16cid:durableId="354816311">
     <w:abstractNumId w:val="10"/>
   </w:num>
-  <w:num w:numId="20">
+  <w:num w:numId="20" w16cid:durableId="503667259">
     <w:abstractNumId w:val="32"/>
   </w:num>
-  <w:num w:numId="21">
+  <w:num w:numId="21" w16cid:durableId="952133225">
     <w:abstractNumId w:val="19"/>
   </w:num>
-  <w:num w:numId="22">
+  <w:num w:numId="22" w16cid:durableId="1432319139">
     <w:abstractNumId w:val="18"/>
   </w:num>
-  <w:num w:numId="23">
+  <w:num w:numId="23" w16cid:durableId="2067146951">
     <w:abstractNumId w:val="8"/>
   </w:num>
-  <w:num w:numId="24">
+  <w:num w:numId="24" w16cid:durableId="1387028719">
     <w:abstractNumId w:val="21"/>
   </w:num>
-  <w:num w:numId="25">
+  <w:num w:numId="25" w16cid:durableId="72287560">
     <w:abstractNumId w:val="31"/>
   </w:num>
-  <w:num w:numId="26">
+  <w:num w:numId="26" w16cid:durableId="228655232">
     <w:abstractNumId w:val="30"/>
   </w:num>
-  <w:num w:numId="27">
+  <w:num w:numId="27" w16cid:durableId="1367490159">
     <w:abstractNumId w:val="3"/>
   </w:num>
-  <w:num w:numId="28">
+  <w:num w:numId="28" w16cid:durableId="566645020">
     <w:abstractNumId w:val="17"/>
   </w:num>
-  <w:num w:numId="29">
+  <w:num w:numId="29" w16cid:durableId="2083870686">
     <w:abstractNumId w:val="6"/>
   </w:num>
-  <w:num w:numId="30">
+  <w:num w:numId="30" w16cid:durableId="2030906988">
     <w:abstractNumId w:val="5"/>
   </w:num>
-  <w:num w:numId="31">
+  <w:num w:numId="31" w16cid:durableId="1140221367">
     <w:abstractNumId w:val="11"/>
   </w:num>
-  <w:num w:numId="32">
+  <w:num w:numId="32" w16cid:durableId="1791821076">
     <w:abstractNumId w:val="0"/>
   </w:num>
-  <w:num w:numId="33">
+  <w:num w:numId="33" w16cid:durableId="393939846">
     <w:abstractNumId w:val="24"/>
   </w:num>
-  <w:num w:numId="34">
+  <w:num w:numId="34" w16cid:durableId="1845976319">
     <w:abstractNumId w:val="4"/>
   </w:num>
 </w:numbering>
 </file>
 
 <file path=word/styles.xml><?xml version="1.0" encoding="utf-8"?>
-<w:styles xmlns:mc="http://schemas.openxmlformats.org/markup-compatibility/2006" xmlns:r="http://schemas.openxmlformats.org/officeDocument/2006/relationships" xmlns:w="http://schemas.openxmlformats.org/wordprocessingml/2006/main" xmlns:w14="http://schemas.microsoft.com/office/word/2010/wordml" xmlns:w15="http://schemas.microsoft.com/office/word/2012/wordml" xmlns:w16se="http://schemas.microsoft.com/office/word/2015/wordml/symex" mc:Ignorable="w14 w15 w16se">
+<w:styles xmlns:mc="http://schemas.openxmlformats.org/markup-compatibility/2006" xmlns:r="http://schemas.openxmlformats.org/officeDocument/2006/relationships" xmlns:w="http://schemas.openxmlformats.org/wordprocessingml/2006/main" xmlns:w14="http://schemas.microsoft.com/office/word/2010/wordml" xmlns:w15="http://schemas.microsoft.com/office/word/2012/wordml" xmlns:w16cex="http://schemas.microsoft.com/office/word/2018/wordml/cex" xmlns:w16cid="http://schemas.microsoft.com/office/word/2016/wordml/cid" xmlns:w16="http://schemas.microsoft.com/office/word/2018/wordml" xmlns:w16du="http://schemas.microsoft.com/office/word/2023/wordml/word16du" xmlns:w16sdtdh="http://schemas.microsoft.com/office/word/2020/wordml/sdtdatahash" xmlns:w16sdtfl="http://schemas.microsoft.com/office/word/2024/wordml/sdtformatlock" xmlns:w16se="http://schemas.microsoft.com/office/word/2015/wordml/symex" mc:Ignorable="w14 w15 w16se w16cid w16 w16cex w16sdtdh w16sdtfl w16du">
   <w:docDefaults>
     <w:rPrDefault>
       <w:rPr>
@@ -9105,7 +8213,7 @@
       </w:pPr>
     </w:pPrDefault>
   </w:docDefaults>
-  <w:latentStyles w:defLockedState="0" w:defUIPriority="99" w:defSemiHidden="0" w:defUnhideWhenUsed="0" w:defQFormat="0" w:count="371">
+  <w:latentStyles w:defLockedState="0" w:defUIPriority="99" w:defSemiHidden="0" w:defUnhideWhenUsed="0" w:defQFormat="0" w:count="376">
     <w:lsdException w:name="Normal" w:uiPriority="0" w:qFormat="1"/>
     <w:lsdException w:name="heading 1" w:uiPriority="9" w:qFormat="1"/>
     <w:lsdException w:name="heading 2" w:semiHidden="1" w:uiPriority="9" w:unhideWhenUsed="1" w:qFormat="1"/>
@@ -9477,6 +8585,11 @@
     <w:lsdException w:name="List Table 5 Dark Accent 6" w:uiPriority="50"/>
     <w:lsdException w:name="List Table 6 Colorful Accent 6" w:uiPriority="51"/>
     <w:lsdException w:name="List Table 7 Colorful Accent 6" w:uiPriority="52"/>
+    <w:lsdException w:name="Mention" w:semiHidden="1" w:unhideWhenUsed="1"/>
+    <w:lsdException w:name="Smart Hyperlink" w:semiHidden="1" w:unhideWhenUsed="1"/>
+    <w:lsdException w:name="Hashtag" w:semiHidden="1" w:unhideWhenUsed="1"/>
+    <w:lsdException w:name="Unresolved Mention" w:semiHidden="1" w:unhideWhenUsed="1"/>
+    <w:lsdException w:name="Smart Link" w:semiHidden="1" w:unhideWhenUsed="1"/>
   </w:latentStyles>
   <w:style w:type="paragraph" w:default="1" w:styleId="Normal">
     <w:name w:val="Normal"/>
@@ -9565,7 +8678,7 @@
       <w:szCs w:val="27"/>
     </w:rPr>
   </w:style>
-  <w:style w:type="character" w:styleId="Textoennegrita">
+  <w:style w:type="character" w:styleId="Fuerte">
     <w:name w:val="Strong"/>
     <w:basedOn w:val="Fuentedeprrafopredeter"/>
     <w:uiPriority w:val="22"/>

</xml_diff>